<commit_message>
docs: Ressourcen-Gesamtübersicht in Word-Dokumentation ergänzt
Neues Kapitel 5 mit 6 tabellarischen Übersichten (Governance, Logging,
Security, Hub-Networking, Spoke, Subscription Vending) inkl. Anzahl und
Kostenkategorie je Ressourcentyp. Übrige Kapitel auf 6–13 verschoben.

https://claude.ai/code/session_01D8RF4iQ1Ez5rEe9gqjL3XQ
</commit_message>
<xml_diff>
--- a/docs/kickoff/Azure-Landing-Zone-Dokumentation.docx
+++ b/docs/kickoff/Azure-Landing-Zone-Dokumentation.docx
@@ -1024,7 +1024,4065 @@
         <w:pStyle w:val="Heading1"/>
       </w:pPr>
       <w:r>
-        <w:t>5. Infrastructure as Code &amp; CI/CD</w:t>
+        <w:t>5. Erstellte Azure-Ressourcen – Gesamtübersicht</w:t>
+      </w:r>
+    </w:p>
+    <w:p>
+      <w:pPr>
+        <w:spacing w:after="120"/>
+      </w:pPr>
+      <w:r>
+        <w:t>Die folgende Tabelle listet alle Azure-Ressourcen, die durch die Landing-Zone-Templates erstellt werden. Ressourcen mit Scope 'Tenant' benötigen keine Subscription, alle übrigen werden in den angegebenen Platform-Subscriptions angelegt.</w:t>
+      </w:r>
+    </w:p>
+    <w:p>
+      <w:pPr>
+        <w:pStyle w:val="Heading2"/>
+      </w:pPr>
+      <w:r>
+        <w:t>5.1 Governance (Tenant-Scope)</w:t>
+      </w:r>
+    </w:p>
+    <w:tbl>
+      <w:tblPr>
+        <w:tblStyle w:val="LightGrid-Accent1"/>
+        <w:tblW w:type="auto" w:w="0"/>
+        <w:jc w:val="center"/>
+        <w:tblLook w:firstColumn="1" w:firstRow="1" w:lastColumn="0" w:lastRow="0" w:noHBand="0" w:noVBand="1" w:val="04A0"/>
+      </w:tblPr>
+      <w:tblGrid>
+        <w:gridCol w:w="2160"/>
+        <w:gridCol w:w="2160"/>
+        <w:gridCol w:w="2160"/>
+        <w:gridCol w:w="2160"/>
+      </w:tblGrid>
+      <w:tr>
+        <w:tc>
+          <w:tcPr>
+            <w:tcW w:type="dxa" w:w="3312"/>
+            <w:shd w:val="clear" w:color="auto" w:fill="0078D4"/>
+          </w:tcPr>
+          <w:p>
+            <w:pPr>
+              <w:spacing w:after="40" w:before="40"/>
+            </w:pPr>
+            <w:r/>
+            <w:r>
+              <w:rPr>
+                <w:b/>
+                <w:color w:val="FFFFFF"/>
+                <w:sz w:val="19"/>
+              </w:rPr>
+              <w:t>Ressourcentyp</w:t>
+            </w:r>
+          </w:p>
+        </w:tc>
+        <w:tc>
+          <w:tcPr>
+            <w:tcW w:type="dxa" w:w="5184"/>
+            <w:shd w:val="clear" w:color="auto" w:fill="0078D4"/>
+          </w:tcPr>
+          <w:p>
+            <w:pPr>
+              <w:spacing w:after="40" w:before="40"/>
+            </w:pPr>
+            <w:r/>
+            <w:r>
+              <w:rPr>
+                <w:b/>
+                <w:color w:val="FFFFFF"/>
+                <w:sz w:val="19"/>
+              </w:rPr>
+              <w:t>Name / Konvention</w:t>
+            </w:r>
+          </w:p>
+        </w:tc>
+        <w:tc>
+          <w:tcPr>
+            <w:tcW w:type="dxa" w:w="1008"/>
+            <w:shd w:val="clear" w:color="auto" w:fill="0078D4"/>
+          </w:tcPr>
+          <w:p>
+            <w:pPr>
+              <w:spacing w:after="40" w:before="40"/>
+            </w:pPr>
+            <w:r/>
+            <w:r>
+              <w:rPr>
+                <w:b/>
+                <w:color w:val="FFFFFF"/>
+                <w:sz w:val="19"/>
+              </w:rPr>
+              <w:t>Anzahl</w:t>
+            </w:r>
+          </w:p>
+        </w:tc>
+        <w:tc>
+          <w:tcPr>
+            <w:tcW w:type="dxa" w:w="2016"/>
+            <w:shd w:val="clear" w:color="auto" w:fill="0078D4"/>
+          </w:tcPr>
+          <w:p>
+            <w:pPr>
+              <w:spacing w:after="40" w:before="40"/>
+            </w:pPr>
+            <w:r/>
+            <w:r>
+              <w:rPr>
+                <w:b/>
+                <w:color w:val="FFFFFF"/>
+                <w:sz w:val="19"/>
+              </w:rPr>
+              <w:t>Kosten</w:t>
+            </w:r>
+          </w:p>
+        </w:tc>
+      </w:tr>
+      <w:tr>
+        <w:tc>
+          <w:tcPr>
+            <w:tcW w:type="dxa" w:w="3312"/>
+          </w:tcPr>
+          <w:p>
+            <w:pPr>
+              <w:spacing w:after="40" w:before="40"/>
+            </w:pPr>
+            <w:r/>
+            <w:r>
+              <w:rPr>
+                <w:b w:val="0"/>
+                <w:sz w:val="19"/>
+              </w:rPr>
+              <w:t>Management Group</w:t>
+            </w:r>
+          </w:p>
+        </w:tc>
+        <w:tc>
+          <w:tcPr>
+            <w:tcW w:type="dxa" w:w="5184"/>
+          </w:tcPr>
+          <w:p>
+            <w:pPr>
+              <w:spacing w:after="40" w:before="40"/>
+            </w:pPr>
+            <w:r/>
+            <w:r>
+              <w:rPr>
+                <w:b w:val="0"/>
+                <w:sz w:val="19"/>
+              </w:rPr>
+              <w:t>alz, alz-platform, alz-platform-{connectivity,identity,management,security}, alz-landingzones, alz-landingzones-{corp,online,local}, alz-sandbox, alz-decommissioned</w:t>
+            </w:r>
+          </w:p>
+        </w:tc>
+        <w:tc>
+          <w:tcPr>
+            <w:tcW w:type="dxa" w:w="1008"/>
+          </w:tcPr>
+          <w:p>
+            <w:pPr>
+              <w:spacing w:after="40" w:before="40"/>
+            </w:pPr>
+            <w:r/>
+            <w:r>
+              <w:rPr>
+                <w:b w:val="0"/>
+                <w:sz w:val="19"/>
+              </w:rPr>
+              <w:t>12</w:t>
+            </w:r>
+          </w:p>
+        </w:tc>
+        <w:tc>
+          <w:tcPr>
+            <w:tcW w:type="dxa" w:w="2016"/>
+          </w:tcPr>
+          <w:p>
+            <w:pPr>
+              <w:spacing w:after="40" w:before="40"/>
+            </w:pPr>
+            <w:r/>
+            <w:r>
+              <w:rPr>
+                <w:b w:val="0"/>
+                <w:sz w:val="19"/>
+              </w:rPr>
+              <w:t>Kostenlos</w:t>
+            </w:r>
+          </w:p>
+        </w:tc>
+      </w:tr>
+      <w:tr>
+        <w:tc>
+          <w:tcPr>
+            <w:tcW w:type="dxa" w:w="3312"/>
+          </w:tcPr>
+          <w:p>
+            <w:pPr>
+              <w:spacing w:after="40" w:before="40"/>
+            </w:pPr>
+            <w:r/>
+            <w:r>
+              <w:rPr>
+                <w:b w:val="0"/>
+                <w:sz w:val="19"/>
+              </w:rPr>
+              <w:t>Policy Assignment – Deny Location</w:t>
+            </w:r>
+          </w:p>
+        </w:tc>
+        <w:tc>
+          <w:tcPr>
+            <w:tcW w:type="dxa" w:w="5184"/>
+          </w:tcPr>
+          <w:p>
+            <w:pPr>
+              <w:spacing w:after="40" w:before="40"/>
+            </w:pPr>
+            <w:r/>
+            <w:r>
+              <w:rPr>
+                <w:b w:val="0"/>
+                <w:sz w:val="19"/>
+              </w:rPr>
+              <w:t>Deny-Location @ alz</w:t>
+            </w:r>
+          </w:p>
+        </w:tc>
+        <w:tc>
+          <w:tcPr>
+            <w:tcW w:type="dxa" w:w="1008"/>
+          </w:tcPr>
+          <w:p>
+            <w:pPr>
+              <w:spacing w:after="40" w:before="40"/>
+            </w:pPr>
+            <w:r/>
+            <w:r>
+              <w:rPr>
+                <w:b w:val="0"/>
+                <w:sz w:val="19"/>
+              </w:rPr>
+              <w:t>1</w:t>
+            </w:r>
+          </w:p>
+        </w:tc>
+        <w:tc>
+          <w:tcPr>
+            <w:tcW w:type="dxa" w:w="2016"/>
+          </w:tcPr>
+          <w:p>
+            <w:pPr>
+              <w:spacing w:after="40" w:before="40"/>
+            </w:pPr>
+            <w:r/>
+            <w:r>
+              <w:rPr>
+                <w:b w:val="0"/>
+                <w:sz w:val="19"/>
+              </w:rPr>
+              <w:t>Kostenlos</w:t>
+            </w:r>
+          </w:p>
+        </w:tc>
+      </w:tr>
+      <w:tr>
+        <w:tc>
+          <w:tcPr>
+            <w:tcW w:type="dxa" w:w="3312"/>
+          </w:tcPr>
+          <w:p>
+            <w:pPr>
+              <w:spacing w:after="40" w:before="40"/>
+            </w:pPr>
+            <w:r/>
+            <w:r>
+              <w:rPr>
+                <w:b w:val="0"/>
+                <w:sz w:val="19"/>
+              </w:rPr>
+              <w:t>Policy Assignment – Require Tag</w:t>
+            </w:r>
+          </w:p>
+        </w:tc>
+        <w:tc>
+          <w:tcPr>
+            <w:tcW w:type="dxa" w:w="5184"/>
+          </w:tcPr>
+          <w:p>
+            <w:pPr>
+              <w:spacing w:after="40" w:before="40"/>
+            </w:pPr>
+            <w:r/>
+            <w:r>
+              <w:rPr>
+                <w:b w:val="0"/>
+                <w:sz w:val="19"/>
+              </w:rPr>
+              <w:t>Require-RG-Tag @ alz</w:t>
+            </w:r>
+          </w:p>
+        </w:tc>
+        <w:tc>
+          <w:tcPr>
+            <w:tcW w:type="dxa" w:w="1008"/>
+          </w:tcPr>
+          <w:p>
+            <w:pPr>
+              <w:spacing w:after="40" w:before="40"/>
+            </w:pPr>
+            <w:r/>
+            <w:r>
+              <w:rPr>
+                <w:b w:val="0"/>
+                <w:sz w:val="19"/>
+              </w:rPr>
+              <w:t>1</w:t>
+            </w:r>
+          </w:p>
+        </w:tc>
+        <w:tc>
+          <w:tcPr>
+            <w:tcW w:type="dxa" w:w="2016"/>
+          </w:tcPr>
+          <w:p>
+            <w:pPr>
+              <w:spacing w:after="40" w:before="40"/>
+            </w:pPr>
+            <w:r/>
+            <w:r>
+              <w:rPr>
+                <w:b w:val="0"/>
+                <w:sz w:val="19"/>
+              </w:rPr>
+              <w:t>Kostenlos</w:t>
+            </w:r>
+          </w:p>
+        </w:tc>
+      </w:tr>
+      <w:tr>
+        <w:tc>
+          <w:tcPr>
+            <w:tcW w:type="dxa" w:w="3312"/>
+          </w:tcPr>
+          <w:p>
+            <w:pPr>
+              <w:spacing w:after="40" w:before="40"/>
+            </w:pPr>
+            <w:r/>
+            <w:r>
+              <w:rPr>
+                <w:b w:val="0"/>
+                <w:sz w:val="19"/>
+              </w:rPr>
+              <w:t>Policy Assignment – Storage HTTPS</w:t>
+            </w:r>
+          </w:p>
+        </w:tc>
+        <w:tc>
+          <w:tcPr>
+            <w:tcW w:type="dxa" w:w="5184"/>
+          </w:tcPr>
+          <w:p>
+            <w:pPr>
+              <w:spacing w:after="40" w:before="40"/>
+            </w:pPr>
+            <w:r/>
+            <w:r>
+              <w:rPr>
+                <w:b w:val="0"/>
+                <w:sz w:val="19"/>
+              </w:rPr>
+              <w:t>Deny-Storage-Http @ alz</w:t>
+            </w:r>
+          </w:p>
+        </w:tc>
+        <w:tc>
+          <w:tcPr>
+            <w:tcW w:type="dxa" w:w="1008"/>
+          </w:tcPr>
+          <w:p>
+            <w:pPr>
+              <w:spacing w:after="40" w:before="40"/>
+            </w:pPr>
+            <w:r/>
+            <w:r>
+              <w:rPr>
+                <w:b w:val="0"/>
+                <w:sz w:val="19"/>
+              </w:rPr>
+              <w:t>1</w:t>
+            </w:r>
+          </w:p>
+        </w:tc>
+        <w:tc>
+          <w:tcPr>
+            <w:tcW w:type="dxa" w:w="2016"/>
+          </w:tcPr>
+          <w:p>
+            <w:pPr>
+              <w:spacing w:after="40" w:before="40"/>
+            </w:pPr>
+            <w:r/>
+            <w:r>
+              <w:rPr>
+                <w:b w:val="0"/>
+                <w:sz w:val="19"/>
+              </w:rPr>
+              <w:t>Kostenlos</w:t>
+            </w:r>
+          </w:p>
+        </w:tc>
+      </w:tr>
+      <w:tr>
+        <w:tc>
+          <w:tcPr>
+            <w:tcW w:type="dxa" w:w="3312"/>
+          </w:tcPr>
+          <w:p>
+            <w:pPr>
+              <w:spacing w:after="40" w:before="40"/>
+            </w:pPr>
+            <w:r/>
+            <w:r>
+              <w:rPr>
+                <w:b w:val="0"/>
+                <w:sz w:val="19"/>
+              </w:rPr>
+              <w:t>Policy Assignment – Deny NIC Public IP</w:t>
+            </w:r>
+          </w:p>
+        </w:tc>
+        <w:tc>
+          <w:tcPr>
+            <w:tcW w:type="dxa" w:w="5184"/>
+          </w:tcPr>
+          <w:p>
+            <w:pPr>
+              <w:spacing w:after="40" w:before="40"/>
+            </w:pPr>
+            <w:r/>
+            <w:r>
+              <w:rPr>
+                <w:b w:val="0"/>
+                <w:sz w:val="19"/>
+              </w:rPr>
+              <w:t>Deny-NIC-PublicIP @ alz-landingzones-corp</w:t>
+            </w:r>
+          </w:p>
+        </w:tc>
+        <w:tc>
+          <w:tcPr>
+            <w:tcW w:type="dxa" w:w="1008"/>
+          </w:tcPr>
+          <w:p>
+            <w:pPr>
+              <w:spacing w:after="40" w:before="40"/>
+            </w:pPr>
+            <w:r/>
+            <w:r>
+              <w:rPr>
+                <w:b w:val="0"/>
+                <w:sz w:val="19"/>
+              </w:rPr>
+              <w:t>1</w:t>
+            </w:r>
+          </w:p>
+        </w:tc>
+        <w:tc>
+          <w:tcPr>
+            <w:tcW w:type="dxa" w:w="2016"/>
+          </w:tcPr>
+          <w:p>
+            <w:pPr>
+              <w:spacing w:after="40" w:before="40"/>
+            </w:pPr>
+            <w:r/>
+            <w:r>
+              <w:rPr>
+                <w:b w:val="0"/>
+                <w:sz w:val="19"/>
+              </w:rPr>
+              <w:t>Kostenlos</w:t>
+            </w:r>
+          </w:p>
+        </w:tc>
+      </w:tr>
+      <w:tr>
+        <w:tc>
+          <w:tcPr>
+            <w:tcW w:type="dxa" w:w="3312"/>
+          </w:tcPr>
+          <w:p>
+            <w:pPr>
+              <w:spacing w:after="40" w:before="40"/>
+            </w:pPr>
+            <w:r/>
+            <w:r>
+              <w:rPr>
+                <w:b w:val="0"/>
+                <w:sz w:val="19"/>
+              </w:rPr>
+              <w:t>Policy Assignment – Deny Resource Types</w:t>
+            </w:r>
+          </w:p>
+        </w:tc>
+        <w:tc>
+          <w:tcPr>
+            <w:tcW w:type="dxa" w:w="5184"/>
+          </w:tcPr>
+          <w:p>
+            <w:pPr>
+              <w:spacing w:after="40" w:before="40"/>
+            </w:pPr>
+            <w:r/>
+            <w:r>
+              <w:rPr>
+                <w:b w:val="0"/>
+                <w:sz w:val="19"/>
+              </w:rPr>
+              <w:t>Deny-All @ alz-decommissioned (leere Allowed-Liste)</w:t>
+            </w:r>
+          </w:p>
+        </w:tc>
+        <w:tc>
+          <w:tcPr>
+            <w:tcW w:type="dxa" w:w="1008"/>
+          </w:tcPr>
+          <w:p>
+            <w:pPr>
+              <w:spacing w:after="40" w:before="40"/>
+            </w:pPr>
+            <w:r/>
+            <w:r>
+              <w:rPr>
+                <w:b w:val="0"/>
+                <w:sz w:val="19"/>
+              </w:rPr>
+              <w:t>1</w:t>
+            </w:r>
+          </w:p>
+        </w:tc>
+        <w:tc>
+          <w:tcPr>
+            <w:tcW w:type="dxa" w:w="2016"/>
+          </w:tcPr>
+          <w:p>
+            <w:pPr>
+              <w:spacing w:after="40" w:before="40"/>
+            </w:pPr>
+            <w:r/>
+            <w:r>
+              <w:rPr>
+                <w:b w:val="0"/>
+                <w:sz w:val="19"/>
+              </w:rPr>
+              <w:t>Kostenlos</w:t>
+            </w:r>
+          </w:p>
+        </w:tc>
+      </w:tr>
+      <w:tr>
+        <w:tc>
+          <w:tcPr>
+            <w:tcW w:type="dxa" w:w="3312"/>
+          </w:tcPr>
+          <w:p>
+            <w:pPr>
+              <w:spacing w:after="40" w:before="40"/>
+            </w:pPr>
+            <w:r/>
+            <w:r>
+              <w:rPr>
+                <w:b w:val="0"/>
+                <w:sz w:val="19"/>
+              </w:rPr>
+              <w:t>Policy Exemption</w:t>
+            </w:r>
+          </w:p>
+        </w:tc>
+        <w:tc>
+          <w:tcPr>
+            <w:tcW w:type="dxa" w:w="5184"/>
+          </w:tcPr>
+          <w:p>
+            <w:pPr>
+              <w:spacing w:after="40" w:before="40"/>
+            </w:pPr>
+            <w:r/>
+            <w:r>
+              <w:rPr>
+                <w:b w:val="0"/>
+                <w:sz w:val="19"/>
+              </w:rPr>
+              <w:t>Require-RG-Tag Ausnahme @ alz-sandbox</w:t>
+            </w:r>
+          </w:p>
+        </w:tc>
+        <w:tc>
+          <w:tcPr>
+            <w:tcW w:type="dxa" w:w="1008"/>
+          </w:tcPr>
+          <w:p>
+            <w:pPr>
+              <w:spacing w:after="40" w:before="40"/>
+            </w:pPr>
+            <w:r/>
+            <w:r>
+              <w:rPr>
+                <w:b w:val="0"/>
+                <w:sz w:val="19"/>
+              </w:rPr>
+              <w:t>1</w:t>
+            </w:r>
+          </w:p>
+        </w:tc>
+        <w:tc>
+          <w:tcPr>
+            <w:tcW w:type="dxa" w:w="2016"/>
+          </w:tcPr>
+          <w:p>
+            <w:pPr>
+              <w:spacing w:after="40" w:before="40"/>
+            </w:pPr>
+            <w:r/>
+            <w:r>
+              <w:rPr>
+                <w:b w:val="0"/>
+                <w:sz w:val="19"/>
+              </w:rPr>
+              <w:t>Kostenlos</w:t>
+            </w:r>
+          </w:p>
+        </w:tc>
+      </w:tr>
+      <w:tr>
+        <w:tc>
+          <w:tcPr>
+            <w:tcW w:type="dxa" w:w="3312"/>
+          </w:tcPr>
+          <w:p>
+            <w:pPr>
+              <w:spacing w:after="40" w:before="40"/>
+            </w:pPr>
+            <w:r/>
+            <w:r>
+              <w:rPr>
+                <w:b w:val="0"/>
+                <w:sz w:val="19"/>
+              </w:rPr>
+              <w:t>RBAC Role Assignment</w:t>
+            </w:r>
+          </w:p>
+        </w:tc>
+        <w:tc>
+          <w:tcPr>
+            <w:tcW w:type="dxa" w:w="5184"/>
+          </w:tcPr>
+          <w:p>
+            <w:pPr>
+              <w:spacing w:after="40" w:before="40"/>
+            </w:pPr>
+            <w:r/>
+            <w:r>
+              <w:rPr>
+                <w:b w:val="0"/>
+                <w:sz w:val="19"/>
+              </w:rPr>
+              <w:t>Owner/Contributor/Reader je Entra-Gruppe (konfigurierbar)</w:t>
+            </w:r>
+          </w:p>
+        </w:tc>
+        <w:tc>
+          <w:tcPr>
+            <w:tcW w:type="dxa" w:w="1008"/>
+          </w:tcPr>
+          <w:p>
+            <w:pPr>
+              <w:spacing w:after="40" w:before="40"/>
+            </w:pPr>
+            <w:r/>
+            <w:r>
+              <w:rPr>
+                <w:b w:val="0"/>
+                <w:sz w:val="19"/>
+              </w:rPr>
+              <w:t>n</w:t>
+            </w:r>
+          </w:p>
+        </w:tc>
+        <w:tc>
+          <w:tcPr>
+            <w:tcW w:type="dxa" w:w="2016"/>
+          </w:tcPr>
+          <w:p>
+            <w:pPr>
+              <w:spacing w:after="40" w:before="40"/>
+            </w:pPr>
+            <w:r/>
+            <w:r>
+              <w:rPr>
+                <w:b w:val="0"/>
+                <w:sz w:val="19"/>
+              </w:rPr>
+              <w:t>Kostenlos</w:t>
+            </w:r>
+          </w:p>
+        </w:tc>
+      </w:tr>
+    </w:tbl>
+    <w:p/>
+    <w:p>
+      <w:pPr>
+        <w:pStyle w:val="Heading2"/>
+      </w:pPr>
+      <w:r>
+        <w:t>5.2 Logging (Management-Subscription)</w:t>
+      </w:r>
+    </w:p>
+    <w:tbl>
+      <w:tblPr>
+        <w:tblStyle w:val="LightGrid-Accent1"/>
+        <w:tblW w:type="auto" w:w="0"/>
+        <w:jc w:val="center"/>
+        <w:tblLook w:firstColumn="1" w:firstRow="1" w:lastColumn="0" w:lastRow="0" w:noHBand="0" w:noVBand="1" w:val="04A0"/>
+      </w:tblPr>
+      <w:tblGrid>
+        <w:gridCol w:w="2160"/>
+        <w:gridCol w:w="2160"/>
+        <w:gridCol w:w="2160"/>
+        <w:gridCol w:w="2160"/>
+      </w:tblGrid>
+      <w:tr>
+        <w:tc>
+          <w:tcPr>
+            <w:tcW w:type="dxa" w:w="3312"/>
+            <w:shd w:val="clear" w:color="auto" w:fill="0078D4"/>
+          </w:tcPr>
+          <w:p>
+            <w:pPr>
+              <w:spacing w:after="40" w:before="40"/>
+            </w:pPr>
+            <w:r/>
+            <w:r>
+              <w:rPr>
+                <w:b/>
+                <w:color w:val="FFFFFF"/>
+                <w:sz w:val="19"/>
+              </w:rPr>
+              <w:t>Ressourcentyp</w:t>
+            </w:r>
+          </w:p>
+        </w:tc>
+        <w:tc>
+          <w:tcPr>
+            <w:tcW w:type="dxa" w:w="5184"/>
+            <w:shd w:val="clear" w:color="auto" w:fill="0078D4"/>
+          </w:tcPr>
+          <w:p>
+            <w:pPr>
+              <w:spacing w:after="40" w:before="40"/>
+            </w:pPr>
+            <w:r/>
+            <w:r>
+              <w:rPr>
+                <w:b/>
+                <w:color w:val="FFFFFF"/>
+                <w:sz w:val="19"/>
+              </w:rPr>
+              <w:t>Name / Konvention</w:t>
+            </w:r>
+          </w:p>
+        </w:tc>
+        <w:tc>
+          <w:tcPr>
+            <w:tcW w:type="dxa" w:w="1008"/>
+            <w:shd w:val="clear" w:color="auto" w:fill="0078D4"/>
+          </w:tcPr>
+          <w:p>
+            <w:pPr>
+              <w:spacing w:after="40" w:before="40"/>
+            </w:pPr>
+            <w:r/>
+            <w:r>
+              <w:rPr>
+                <w:b/>
+                <w:color w:val="FFFFFF"/>
+                <w:sz w:val="19"/>
+              </w:rPr>
+              <w:t>Anzahl</w:t>
+            </w:r>
+          </w:p>
+        </w:tc>
+        <w:tc>
+          <w:tcPr>
+            <w:tcW w:type="dxa" w:w="2016"/>
+            <w:shd w:val="clear" w:color="auto" w:fill="0078D4"/>
+          </w:tcPr>
+          <w:p>
+            <w:pPr>
+              <w:spacing w:after="40" w:before="40"/>
+            </w:pPr>
+            <w:r/>
+            <w:r>
+              <w:rPr>
+                <w:b/>
+                <w:color w:val="FFFFFF"/>
+                <w:sz w:val="19"/>
+              </w:rPr>
+              <w:t>Kosten</w:t>
+            </w:r>
+          </w:p>
+        </w:tc>
+      </w:tr>
+      <w:tr>
+        <w:tc>
+          <w:tcPr>
+            <w:tcW w:type="dxa" w:w="3312"/>
+          </w:tcPr>
+          <w:p>
+            <w:pPr>
+              <w:spacing w:after="40" w:before="40"/>
+            </w:pPr>
+            <w:r/>
+            <w:r>
+              <w:rPr>
+                <w:b w:val="0"/>
+                <w:sz w:val="19"/>
+              </w:rPr>
+              <w:t>Resource Group</w:t>
+            </w:r>
+          </w:p>
+        </w:tc>
+        <w:tc>
+          <w:tcPr>
+            <w:tcW w:type="dxa" w:w="5184"/>
+          </w:tcPr>
+          <w:p>
+            <w:pPr>
+              <w:spacing w:after="40" w:before="40"/>
+            </w:pPr>
+            <w:r/>
+            <w:r>
+              <w:rPr>
+                <w:b w:val="0"/>
+                <w:sz w:val="19"/>
+              </w:rPr>
+              <w:t>rg-alz-logging-germanywestcentral</w:t>
+            </w:r>
+          </w:p>
+        </w:tc>
+        <w:tc>
+          <w:tcPr>
+            <w:tcW w:type="dxa" w:w="1008"/>
+          </w:tcPr>
+          <w:p>
+            <w:pPr>
+              <w:spacing w:after="40" w:before="40"/>
+            </w:pPr>
+            <w:r/>
+            <w:r>
+              <w:rPr>
+                <w:b w:val="0"/>
+                <w:sz w:val="19"/>
+              </w:rPr>
+              <w:t>1</w:t>
+            </w:r>
+          </w:p>
+        </w:tc>
+        <w:tc>
+          <w:tcPr>
+            <w:tcW w:type="dxa" w:w="2016"/>
+          </w:tcPr>
+          <w:p>
+            <w:pPr>
+              <w:spacing w:after="40" w:before="40"/>
+            </w:pPr>
+            <w:r/>
+            <w:r>
+              <w:rPr>
+                <w:b w:val="0"/>
+                <w:sz w:val="19"/>
+              </w:rPr>
+              <w:t>Kostenlos</w:t>
+            </w:r>
+          </w:p>
+        </w:tc>
+      </w:tr>
+      <w:tr>
+        <w:tc>
+          <w:tcPr>
+            <w:tcW w:type="dxa" w:w="3312"/>
+          </w:tcPr>
+          <w:p>
+            <w:pPr>
+              <w:spacing w:after="40" w:before="40"/>
+            </w:pPr>
+            <w:r/>
+            <w:r>
+              <w:rPr>
+                <w:b w:val="0"/>
+                <w:sz w:val="19"/>
+              </w:rPr>
+              <w:t>Log Analytics Workspace</w:t>
+            </w:r>
+          </w:p>
+        </w:tc>
+        <w:tc>
+          <w:tcPr>
+            <w:tcW w:type="dxa" w:w="5184"/>
+          </w:tcPr>
+          <w:p>
+            <w:pPr>
+              <w:spacing w:after="40" w:before="40"/>
+            </w:pPr>
+            <w:r/>
+            <w:r>
+              <w:rPr>
+                <w:b w:val="0"/>
+                <w:sz w:val="19"/>
+              </w:rPr>
+              <w:t>law-alz-germanywestcentral (365 Tage, PerGB2018)</w:t>
+            </w:r>
+          </w:p>
+        </w:tc>
+        <w:tc>
+          <w:tcPr>
+            <w:tcW w:type="dxa" w:w="1008"/>
+          </w:tcPr>
+          <w:p>
+            <w:pPr>
+              <w:spacing w:after="40" w:before="40"/>
+            </w:pPr>
+            <w:r/>
+            <w:r>
+              <w:rPr>
+                <w:b w:val="0"/>
+                <w:sz w:val="19"/>
+              </w:rPr>
+              <w:t>1</w:t>
+            </w:r>
+          </w:p>
+        </w:tc>
+        <w:tc>
+          <w:tcPr>
+            <w:tcW w:type="dxa" w:w="2016"/>
+          </w:tcPr>
+          <w:p>
+            <w:pPr>
+              <w:spacing w:after="40" w:before="40"/>
+            </w:pPr>
+            <w:r/>
+            <w:r>
+              <w:rPr>
+                <w:b w:val="0"/>
+                <w:sz w:val="19"/>
+              </w:rPr>
+              <w:t>5 GB/Mon. kostenlos</w:t>
+            </w:r>
+          </w:p>
+        </w:tc>
+      </w:tr>
+      <w:tr>
+        <w:tc>
+          <w:tcPr>
+            <w:tcW w:type="dxa" w:w="3312"/>
+          </w:tcPr>
+          <w:p>
+            <w:pPr>
+              <w:spacing w:after="40" w:before="40"/>
+            </w:pPr>
+            <w:r/>
+            <w:r>
+              <w:rPr>
+                <w:b w:val="0"/>
+                <w:sz w:val="19"/>
+              </w:rPr>
+              <w:t>Data Collection Rule – VM Insights</w:t>
+            </w:r>
+          </w:p>
+        </w:tc>
+        <w:tc>
+          <w:tcPr>
+            <w:tcW w:type="dxa" w:w="5184"/>
+          </w:tcPr>
+          <w:p>
+            <w:pPr>
+              <w:spacing w:after="40" w:before="40"/>
+            </w:pPr>
+            <w:r/>
+            <w:r>
+              <w:rPr>
+                <w:b w:val="0"/>
+                <w:sz w:val="19"/>
+              </w:rPr>
+              <w:t>dcr-alz-vmi-germanywestcentral</w:t>
+            </w:r>
+          </w:p>
+        </w:tc>
+        <w:tc>
+          <w:tcPr>
+            <w:tcW w:type="dxa" w:w="1008"/>
+          </w:tcPr>
+          <w:p>
+            <w:pPr>
+              <w:spacing w:after="40" w:before="40"/>
+            </w:pPr>
+            <w:r/>
+            <w:r>
+              <w:rPr>
+                <w:b w:val="0"/>
+                <w:sz w:val="19"/>
+              </w:rPr>
+              <w:t>1</w:t>
+            </w:r>
+          </w:p>
+        </w:tc>
+        <w:tc>
+          <w:tcPr>
+            <w:tcW w:type="dxa" w:w="2016"/>
+          </w:tcPr>
+          <w:p>
+            <w:pPr>
+              <w:spacing w:after="40" w:before="40"/>
+            </w:pPr>
+            <w:r/>
+            <w:r>
+              <w:rPr>
+                <w:b w:val="0"/>
+                <w:sz w:val="19"/>
+              </w:rPr>
+              <w:t>Im LAW enthalten</w:t>
+            </w:r>
+          </w:p>
+        </w:tc>
+      </w:tr>
+      <w:tr>
+        <w:tc>
+          <w:tcPr>
+            <w:tcW w:type="dxa" w:w="3312"/>
+          </w:tcPr>
+          <w:p>
+            <w:pPr>
+              <w:spacing w:after="40" w:before="40"/>
+            </w:pPr>
+            <w:r/>
+            <w:r>
+              <w:rPr>
+                <w:b w:val="0"/>
+                <w:sz w:val="19"/>
+              </w:rPr>
+              <w:t>Data Collection Rule – Change Tracking</w:t>
+            </w:r>
+          </w:p>
+        </w:tc>
+        <w:tc>
+          <w:tcPr>
+            <w:tcW w:type="dxa" w:w="5184"/>
+          </w:tcPr>
+          <w:p>
+            <w:pPr>
+              <w:spacing w:after="40" w:before="40"/>
+            </w:pPr>
+            <w:r/>
+            <w:r>
+              <w:rPr>
+                <w:b w:val="0"/>
+                <w:sz w:val="19"/>
+              </w:rPr>
+              <w:t>dcr-alz-ct-germanywestcentral</w:t>
+            </w:r>
+          </w:p>
+        </w:tc>
+        <w:tc>
+          <w:tcPr>
+            <w:tcW w:type="dxa" w:w="1008"/>
+          </w:tcPr>
+          <w:p>
+            <w:pPr>
+              <w:spacing w:after="40" w:before="40"/>
+            </w:pPr>
+            <w:r/>
+            <w:r>
+              <w:rPr>
+                <w:b w:val="0"/>
+                <w:sz w:val="19"/>
+              </w:rPr>
+              <w:t>1</w:t>
+            </w:r>
+          </w:p>
+        </w:tc>
+        <w:tc>
+          <w:tcPr>
+            <w:tcW w:type="dxa" w:w="2016"/>
+          </w:tcPr>
+          <w:p>
+            <w:pPr>
+              <w:spacing w:after="40" w:before="40"/>
+            </w:pPr>
+            <w:r/>
+            <w:r>
+              <w:rPr>
+                <w:b w:val="0"/>
+                <w:sz w:val="19"/>
+              </w:rPr>
+              <w:t>Im LAW enthalten</w:t>
+            </w:r>
+          </w:p>
+        </w:tc>
+      </w:tr>
+      <w:tr>
+        <w:tc>
+          <w:tcPr>
+            <w:tcW w:type="dxa" w:w="3312"/>
+          </w:tcPr>
+          <w:p>
+            <w:pPr>
+              <w:spacing w:after="40" w:before="40"/>
+            </w:pPr>
+            <w:r/>
+            <w:r>
+              <w:rPr>
+                <w:b w:val="0"/>
+                <w:sz w:val="19"/>
+              </w:rPr>
+              <w:t>Data Collection Rule – Defender SQL</w:t>
+            </w:r>
+          </w:p>
+        </w:tc>
+        <w:tc>
+          <w:tcPr>
+            <w:tcW w:type="dxa" w:w="5184"/>
+          </w:tcPr>
+          <w:p>
+            <w:pPr>
+              <w:spacing w:after="40" w:before="40"/>
+            </w:pPr>
+            <w:r/>
+            <w:r>
+              <w:rPr>
+                <w:b w:val="0"/>
+                <w:sz w:val="19"/>
+              </w:rPr>
+              <w:t>dcr-alz-sql-germanywestcentral</w:t>
+            </w:r>
+          </w:p>
+        </w:tc>
+        <w:tc>
+          <w:tcPr>
+            <w:tcW w:type="dxa" w:w="1008"/>
+          </w:tcPr>
+          <w:p>
+            <w:pPr>
+              <w:spacing w:after="40" w:before="40"/>
+            </w:pPr>
+            <w:r/>
+            <w:r>
+              <w:rPr>
+                <w:b w:val="0"/>
+                <w:sz w:val="19"/>
+              </w:rPr>
+              <w:t>1</w:t>
+            </w:r>
+          </w:p>
+        </w:tc>
+        <w:tc>
+          <w:tcPr>
+            <w:tcW w:type="dxa" w:w="2016"/>
+          </w:tcPr>
+          <w:p>
+            <w:pPr>
+              <w:spacing w:after="40" w:before="40"/>
+            </w:pPr>
+            <w:r/>
+            <w:r>
+              <w:rPr>
+                <w:b w:val="0"/>
+                <w:sz w:val="19"/>
+              </w:rPr>
+              <w:t>Im LAW enthalten</w:t>
+            </w:r>
+          </w:p>
+        </w:tc>
+      </w:tr>
+      <w:tr>
+        <w:tc>
+          <w:tcPr>
+            <w:tcW w:type="dxa" w:w="3312"/>
+          </w:tcPr>
+          <w:p>
+            <w:pPr>
+              <w:spacing w:after="40" w:before="40"/>
+            </w:pPr>
+            <w:r/>
+            <w:r>
+              <w:rPr>
+                <w:b w:val="0"/>
+                <w:sz w:val="19"/>
+              </w:rPr>
+              <w:t>User-Assigned Managed Identity</w:t>
+            </w:r>
+          </w:p>
+        </w:tc>
+        <w:tc>
+          <w:tcPr>
+            <w:tcW w:type="dxa" w:w="5184"/>
+          </w:tcPr>
+          <w:p>
+            <w:pPr>
+              <w:spacing w:after="40" w:before="40"/>
+            </w:pPr>
+            <w:r/>
+            <w:r>
+              <w:rPr>
+                <w:b w:val="0"/>
+                <w:sz w:val="19"/>
+              </w:rPr>
+              <w:t>mi-alz-germanywestcentral</w:t>
+            </w:r>
+          </w:p>
+        </w:tc>
+        <w:tc>
+          <w:tcPr>
+            <w:tcW w:type="dxa" w:w="1008"/>
+          </w:tcPr>
+          <w:p>
+            <w:pPr>
+              <w:spacing w:after="40" w:before="40"/>
+            </w:pPr>
+            <w:r/>
+            <w:r>
+              <w:rPr>
+                <w:b w:val="0"/>
+                <w:sz w:val="19"/>
+              </w:rPr>
+              <w:t>1</w:t>
+            </w:r>
+          </w:p>
+        </w:tc>
+        <w:tc>
+          <w:tcPr>
+            <w:tcW w:type="dxa" w:w="2016"/>
+          </w:tcPr>
+          <w:p>
+            <w:pPr>
+              <w:spacing w:after="40" w:before="40"/>
+            </w:pPr>
+            <w:r/>
+            <w:r>
+              <w:rPr>
+                <w:b w:val="0"/>
+                <w:sz w:val="19"/>
+              </w:rPr>
+              <w:t>Kostenlos</w:t>
+            </w:r>
+          </w:p>
+        </w:tc>
+      </w:tr>
+      <w:tr>
+        <w:tc>
+          <w:tcPr>
+            <w:tcW w:type="dxa" w:w="3312"/>
+          </w:tcPr>
+          <w:p>
+            <w:pPr>
+              <w:spacing w:after="40" w:before="40"/>
+            </w:pPr>
+            <w:r/>
+            <w:r>
+              <w:rPr>
+                <w:b w:val="0"/>
+                <w:sz w:val="19"/>
+              </w:rPr>
+              <w:t>LAW Solution – ChangeTracking</w:t>
+            </w:r>
+          </w:p>
+        </w:tc>
+        <w:tc>
+          <w:tcPr>
+            <w:tcW w:type="dxa" w:w="5184"/>
+          </w:tcPr>
+          <w:p>
+            <w:pPr>
+              <w:spacing w:after="40" w:before="40"/>
+            </w:pPr>
+            <w:r/>
+            <w:r>
+              <w:rPr>
+                <w:b w:val="0"/>
+                <w:sz w:val="19"/>
+              </w:rPr>
+              <w:t>ChangeTracking</w:t>
+            </w:r>
+          </w:p>
+        </w:tc>
+        <w:tc>
+          <w:tcPr>
+            <w:tcW w:type="dxa" w:w="1008"/>
+          </w:tcPr>
+          <w:p>
+            <w:pPr>
+              <w:spacing w:after="40" w:before="40"/>
+            </w:pPr>
+            <w:r/>
+            <w:r>
+              <w:rPr>
+                <w:b w:val="0"/>
+                <w:sz w:val="19"/>
+              </w:rPr>
+              <w:t>1</w:t>
+            </w:r>
+          </w:p>
+        </w:tc>
+        <w:tc>
+          <w:tcPr>
+            <w:tcW w:type="dxa" w:w="2016"/>
+          </w:tcPr>
+          <w:p>
+            <w:pPr>
+              <w:spacing w:after="40" w:before="40"/>
+            </w:pPr>
+            <w:r/>
+            <w:r>
+              <w:rPr>
+                <w:b w:val="0"/>
+                <w:sz w:val="19"/>
+              </w:rPr>
+              <w:t>Im LAW enthalten</w:t>
+            </w:r>
+          </w:p>
+        </w:tc>
+      </w:tr>
+    </w:tbl>
+    <w:p/>
+    <w:p>
+      <w:pPr>
+        <w:pStyle w:val="Heading2"/>
+      </w:pPr>
+      <w:r>
+        <w:t>5.3 Security-Baseline (je Subscription)</w:t>
+      </w:r>
+    </w:p>
+    <w:p>
+      <w:pPr>
+        <w:spacing w:after="120"/>
+      </w:pPr>
+      <w:r>
+        <w:t>Die folgenden Ressourcen werden per Subscription deployt (Management, Connectivity, Workload).</w:t>
+      </w:r>
+    </w:p>
+    <w:tbl>
+      <w:tblPr>
+        <w:tblStyle w:val="LightGrid-Accent1"/>
+        <w:tblW w:type="auto" w:w="0"/>
+        <w:jc w:val="center"/>
+        <w:tblLook w:firstColumn="1" w:firstRow="1" w:lastColumn="0" w:lastRow="0" w:noHBand="0" w:noVBand="1" w:val="04A0"/>
+      </w:tblPr>
+      <w:tblGrid>
+        <w:gridCol w:w="2160"/>
+        <w:gridCol w:w="2160"/>
+        <w:gridCol w:w="2160"/>
+        <w:gridCol w:w="2160"/>
+      </w:tblGrid>
+      <w:tr>
+        <w:tc>
+          <w:tcPr>
+            <w:tcW w:type="dxa" w:w="3312"/>
+            <w:shd w:val="clear" w:color="auto" w:fill="0078D4"/>
+          </w:tcPr>
+          <w:p>
+            <w:pPr>
+              <w:spacing w:after="40" w:before="40"/>
+            </w:pPr>
+            <w:r/>
+            <w:r>
+              <w:rPr>
+                <w:b/>
+                <w:color w:val="FFFFFF"/>
+                <w:sz w:val="19"/>
+              </w:rPr>
+              <w:t>Ressourcentyp</w:t>
+            </w:r>
+          </w:p>
+        </w:tc>
+        <w:tc>
+          <w:tcPr>
+            <w:tcW w:type="dxa" w:w="4176"/>
+            <w:shd w:val="clear" w:color="auto" w:fill="0078D4"/>
+          </w:tcPr>
+          <w:p>
+            <w:pPr>
+              <w:spacing w:after="40" w:before="40"/>
+            </w:pPr>
+            <w:r/>
+            <w:r>
+              <w:rPr>
+                <w:b/>
+                <w:color w:val="FFFFFF"/>
+                <w:sz w:val="19"/>
+              </w:rPr>
+              <w:t>Name / Konvention</w:t>
+            </w:r>
+          </w:p>
+        </w:tc>
+        <w:tc>
+          <w:tcPr>
+            <w:tcW w:type="dxa" w:w="1440"/>
+            <w:shd w:val="clear" w:color="auto" w:fill="0078D4"/>
+          </w:tcPr>
+          <w:p>
+            <w:pPr>
+              <w:spacing w:after="40" w:before="40"/>
+            </w:pPr>
+            <w:r/>
+            <w:r>
+              <w:rPr>
+                <w:b/>
+                <w:color w:val="FFFFFF"/>
+                <w:sz w:val="19"/>
+              </w:rPr>
+              <w:t>Anzahl je Sub</w:t>
+            </w:r>
+          </w:p>
+        </w:tc>
+        <w:tc>
+          <w:tcPr>
+            <w:tcW w:type="dxa" w:w="2592"/>
+            <w:shd w:val="clear" w:color="auto" w:fill="0078D4"/>
+          </w:tcPr>
+          <w:p>
+            <w:pPr>
+              <w:spacing w:after="40" w:before="40"/>
+            </w:pPr>
+            <w:r/>
+            <w:r>
+              <w:rPr>
+                <w:b/>
+                <w:color w:val="FFFFFF"/>
+                <w:sz w:val="19"/>
+              </w:rPr>
+              <w:t>Kosten</w:t>
+            </w:r>
+          </w:p>
+        </w:tc>
+      </w:tr>
+      <w:tr>
+        <w:tc>
+          <w:tcPr>
+            <w:tcW w:type="dxa" w:w="3312"/>
+          </w:tcPr>
+          <w:p>
+            <w:pPr>
+              <w:spacing w:after="40" w:before="40"/>
+            </w:pPr>
+            <w:r/>
+            <w:r>
+              <w:rPr>
+                <w:b w:val="0"/>
+                <w:sz w:val="19"/>
+              </w:rPr>
+              <w:t>Defender Pricing – VirtualMachines</w:t>
+            </w:r>
+          </w:p>
+        </w:tc>
+        <w:tc>
+          <w:tcPr>
+            <w:tcW w:type="dxa" w:w="4176"/>
+          </w:tcPr>
+          <w:p>
+            <w:pPr>
+              <w:spacing w:after="40" w:before="40"/>
+            </w:pPr>
+            <w:r/>
+            <w:r>
+              <w:rPr>
+                <w:b w:val="0"/>
+                <w:sz w:val="19"/>
+              </w:rPr>
+              <w:t>VirtualMachines</w:t>
+            </w:r>
+          </w:p>
+        </w:tc>
+        <w:tc>
+          <w:tcPr>
+            <w:tcW w:type="dxa" w:w="1440"/>
+          </w:tcPr>
+          <w:p>
+            <w:pPr>
+              <w:spacing w:after="40" w:before="40"/>
+            </w:pPr>
+            <w:r/>
+            <w:r>
+              <w:rPr>
+                <w:b w:val="0"/>
+                <w:sz w:val="19"/>
+              </w:rPr>
+              <w:t>1</w:t>
+            </w:r>
+          </w:p>
+        </w:tc>
+        <w:tc>
+          <w:tcPr>
+            <w:tcW w:type="dxa" w:w="2592"/>
+          </w:tcPr>
+          <w:p>
+            <w:pPr>
+              <w:spacing w:after="40" w:before="40"/>
+            </w:pPr>
+            <w:r/>
+            <w:r>
+              <w:rPr>
+                <w:b w:val="0"/>
+                <w:sz w:val="19"/>
+              </w:rPr>
+              <w:t>Standard: ~€13/Server/Mon.</w:t>
+            </w:r>
+          </w:p>
+        </w:tc>
+      </w:tr>
+      <w:tr>
+        <w:tc>
+          <w:tcPr>
+            <w:tcW w:type="dxa" w:w="3312"/>
+          </w:tcPr>
+          <w:p>
+            <w:pPr>
+              <w:spacing w:after="40" w:before="40"/>
+            </w:pPr>
+            <w:r/>
+            <w:r>
+              <w:rPr>
+                <w:b w:val="0"/>
+                <w:sz w:val="19"/>
+              </w:rPr>
+              <w:t>Defender Pricing – StorageAccounts</w:t>
+            </w:r>
+          </w:p>
+        </w:tc>
+        <w:tc>
+          <w:tcPr>
+            <w:tcW w:type="dxa" w:w="4176"/>
+          </w:tcPr>
+          <w:p>
+            <w:pPr>
+              <w:spacing w:after="40" w:before="40"/>
+            </w:pPr>
+            <w:r/>
+            <w:r>
+              <w:rPr>
+                <w:b w:val="0"/>
+                <w:sz w:val="19"/>
+              </w:rPr>
+              <w:t>StorageAccounts</w:t>
+            </w:r>
+          </w:p>
+        </w:tc>
+        <w:tc>
+          <w:tcPr>
+            <w:tcW w:type="dxa" w:w="1440"/>
+          </w:tcPr>
+          <w:p>
+            <w:pPr>
+              <w:spacing w:after="40" w:before="40"/>
+            </w:pPr>
+            <w:r/>
+            <w:r>
+              <w:rPr>
+                <w:b w:val="0"/>
+                <w:sz w:val="19"/>
+              </w:rPr>
+              <w:t>1</w:t>
+            </w:r>
+          </w:p>
+        </w:tc>
+        <w:tc>
+          <w:tcPr>
+            <w:tcW w:type="dxa" w:w="2592"/>
+          </w:tcPr>
+          <w:p>
+            <w:pPr>
+              <w:spacing w:after="40" w:before="40"/>
+            </w:pPr>
+            <w:r/>
+            <w:r>
+              <w:rPr>
+                <w:b w:val="0"/>
+                <w:sz w:val="19"/>
+              </w:rPr>
+              <w:t>Standard: transaktionsbasiert</w:t>
+            </w:r>
+          </w:p>
+        </w:tc>
+      </w:tr>
+      <w:tr>
+        <w:tc>
+          <w:tcPr>
+            <w:tcW w:type="dxa" w:w="3312"/>
+          </w:tcPr>
+          <w:p>
+            <w:pPr>
+              <w:spacing w:after="40" w:before="40"/>
+            </w:pPr>
+            <w:r/>
+            <w:r>
+              <w:rPr>
+                <w:b w:val="0"/>
+                <w:sz w:val="19"/>
+              </w:rPr>
+              <w:t>Defender Pricing – KeyVaults</w:t>
+            </w:r>
+          </w:p>
+        </w:tc>
+        <w:tc>
+          <w:tcPr>
+            <w:tcW w:type="dxa" w:w="4176"/>
+          </w:tcPr>
+          <w:p>
+            <w:pPr>
+              <w:spacing w:after="40" w:before="40"/>
+            </w:pPr>
+            <w:r/>
+            <w:r>
+              <w:rPr>
+                <w:b w:val="0"/>
+                <w:sz w:val="19"/>
+              </w:rPr>
+              <w:t>KeyVaults</w:t>
+            </w:r>
+          </w:p>
+        </w:tc>
+        <w:tc>
+          <w:tcPr>
+            <w:tcW w:type="dxa" w:w="1440"/>
+          </w:tcPr>
+          <w:p>
+            <w:pPr>
+              <w:spacing w:after="40" w:before="40"/>
+            </w:pPr>
+            <w:r/>
+            <w:r>
+              <w:rPr>
+                <w:b w:val="0"/>
+                <w:sz w:val="19"/>
+              </w:rPr>
+              <w:t>1</w:t>
+            </w:r>
+          </w:p>
+        </w:tc>
+        <w:tc>
+          <w:tcPr>
+            <w:tcW w:type="dxa" w:w="2592"/>
+          </w:tcPr>
+          <w:p>
+            <w:pPr>
+              <w:spacing w:after="40" w:before="40"/>
+            </w:pPr>
+            <w:r/>
+            <w:r>
+              <w:rPr>
+                <w:b w:val="0"/>
+                <w:sz w:val="19"/>
+              </w:rPr>
+              <w:t>Standard: ~€0,02/10k Tx</w:t>
+            </w:r>
+          </w:p>
+        </w:tc>
+      </w:tr>
+      <w:tr>
+        <w:tc>
+          <w:tcPr>
+            <w:tcW w:type="dxa" w:w="3312"/>
+          </w:tcPr>
+          <w:p>
+            <w:pPr>
+              <w:spacing w:after="40" w:before="40"/>
+            </w:pPr>
+            <w:r/>
+            <w:r>
+              <w:rPr>
+                <w:b w:val="0"/>
+                <w:sz w:val="19"/>
+              </w:rPr>
+              <w:t>Defender Pricing – Arm</w:t>
+            </w:r>
+          </w:p>
+        </w:tc>
+        <w:tc>
+          <w:tcPr>
+            <w:tcW w:type="dxa" w:w="4176"/>
+          </w:tcPr>
+          <w:p>
+            <w:pPr>
+              <w:spacing w:after="40" w:before="40"/>
+            </w:pPr>
+            <w:r/>
+            <w:r>
+              <w:rPr>
+                <w:b w:val="0"/>
+                <w:sz w:val="19"/>
+              </w:rPr>
+              <w:t>Arm (CSPM)</w:t>
+            </w:r>
+          </w:p>
+        </w:tc>
+        <w:tc>
+          <w:tcPr>
+            <w:tcW w:type="dxa" w:w="1440"/>
+          </w:tcPr>
+          <w:p>
+            <w:pPr>
+              <w:spacing w:after="40" w:before="40"/>
+            </w:pPr>
+            <w:r/>
+            <w:r>
+              <w:rPr>
+                <w:b w:val="0"/>
+                <w:sz w:val="19"/>
+              </w:rPr>
+              <w:t>1</w:t>
+            </w:r>
+          </w:p>
+        </w:tc>
+        <w:tc>
+          <w:tcPr>
+            <w:tcW w:type="dxa" w:w="2592"/>
+          </w:tcPr>
+          <w:p>
+            <w:pPr>
+              <w:spacing w:after="40" w:before="40"/>
+            </w:pPr>
+            <w:r/>
+            <w:r>
+              <w:rPr>
+                <w:b w:val="0"/>
+                <w:sz w:val="19"/>
+              </w:rPr>
+              <w:t>Standard: per API-Call</w:t>
+            </w:r>
+          </w:p>
+        </w:tc>
+      </w:tr>
+      <w:tr>
+        <w:tc>
+          <w:tcPr>
+            <w:tcW w:type="dxa" w:w="3312"/>
+          </w:tcPr>
+          <w:p>
+            <w:pPr>
+              <w:spacing w:after="40" w:before="40"/>
+            </w:pPr>
+            <w:r/>
+            <w:r>
+              <w:rPr>
+                <w:b w:val="0"/>
+                <w:sz w:val="19"/>
+              </w:rPr>
+              <w:t>Defender Pricing – Containers</w:t>
+            </w:r>
+          </w:p>
+        </w:tc>
+        <w:tc>
+          <w:tcPr>
+            <w:tcW w:type="dxa" w:w="4176"/>
+          </w:tcPr>
+          <w:p>
+            <w:pPr>
+              <w:spacing w:after="40" w:before="40"/>
+            </w:pPr>
+            <w:r/>
+            <w:r>
+              <w:rPr>
+                <w:b w:val="0"/>
+                <w:sz w:val="19"/>
+              </w:rPr>
+              <w:t>Containers</w:t>
+            </w:r>
+          </w:p>
+        </w:tc>
+        <w:tc>
+          <w:tcPr>
+            <w:tcW w:type="dxa" w:w="1440"/>
+          </w:tcPr>
+          <w:p>
+            <w:pPr>
+              <w:spacing w:after="40" w:before="40"/>
+            </w:pPr>
+            <w:r/>
+            <w:r>
+              <w:rPr>
+                <w:b w:val="0"/>
+                <w:sz w:val="19"/>
+              </w:rPr>
+              <w:t>1</w:t>
+            </w:r>
+          </w:p>
+        </w:tc>
+        <w:tc>
+          <w:tcPr>
+            <w:tcW w:type="dxa" w:w="2592"/>
+          </w:tcPr>
+          <w:p>
+            <w:pPr>
+              <w:spacing w:after="40" w:before="40"/>
+            </w:pPr>
+            <w:r/>
+            <w:r>
+              <w:rPr>
+                <w:b w:val="0"/>
+                <w:sz w:val="19"/>
+              </w:rPr>
+              <w:t>Standard: ~€7/vCPU/Mon.</w:t>
+            </w:r>
+          </w:p>
+        </w:tc>
+      </w:tr>
+      <w:tr>
+        <w:tc>
+          <w:tcPr>
+            <w:tcW w:type="dxa" w:w="3312"/>
+          </w:tcPr>
+          <w:p>
+            <w:pPr>
+              <w:spacing w:after="40" w:before="40"/>
+            </w:pPr>
+            <w:r/>
+            <w:r>
+              <w:rPr>
+                <w:b w:val="0"/>
+                <w:sz w:val="19"/>
+              </w:rPr>
+              <w:t>Defender Pricing – AppServices</w:t>
+            </w:r>
+          </w:p>
+        </w:tc>
+        <w:tc>
+          <w:tcPr>
+            <w:tcW w:type="dxa" w:w="4176"/>
+          </w:tcPr>
+          <w:p>
+            <w:pPr>
+              <w:spacing w:after="40" w:before="40"/>
+            </w:pPr>
+            <w:r/>
+            <w:r>
+              <w:rPr>
+                <w:b w:val="0"/>
+                <w:sz w:val="19"/>
+              </w:rPr>
+              <w:t>AppServices</w:t>
+            </w:r>
+          </w:p>
+        </w:tc>
+        <w:tc>
+          <w:tcPr>
+            <w:tcW w:type="dxa" w:w="1440"/>
+          </w:tcPr>
+          <w:p>
+            <w:pPr>
+              <w:spacing w:after="40" w:before="40"/>
+            </w:pPr>
+            <w:r/>
+            <w:r>
+              <w:rPr>
+                <w:b w:val="0"/>
+                <w:sz w:val="19"/>
+              </w:rPr>
+              <w:t>1</w:t>
+            </w:r>
+          </w:p>
+        </w:tc>
+        <w:tc>
+          <w:tcPr>
+            <w:tcW w:type="dxa" w:w="2592"/>
+          </w:tcPr>
+          <w:p>
+            <w:pPr>
+              <w:spacing w:after="40" w:before="40"/>
+            </w:pPr>
+            <w:r/>
+            <w:r>
+              <w:rPr>
+                <w:b w:val="0"/>
+                <w:sz w:val="19"/>
+              </w:rPr>
+              <w:t>Standard: ~€13/App/Mon.</w:t>
+            </w:r>
+          </w:p>
+        </w:tc>
+      </w:tr>
+      <w:tr>
+        <w:tc>
+          <w:tcPr>
+            <w:tcW w:type="dxa" w:w="3312"/>
+          </w:tcPr>
+          <w:p>
+            <w:pPr>
+              <w:spacing w:after="40" w:before="40"/>
+            </w:pPr>
+            <w:r/>
+            <w:r>
+              <w:rPr>
+                <w:b w:val="0"/>
+                <w:sz w:val="19"/>
+              </w:rPr>
+              <w:t>Defender Pricing – SqlServers</w:t>
+            </w:r>
+          </w:p>
+        </w:tc>
+        <w:tc>
+          <w:tcPr>
+            <w:tcW w:type="dxa" w:w="4176"/>
+          </w:tcPr>
+          <w:p>
+            <w:pPr>
+              <w:spacing w:after="40" w:before="40"/>
+            </w:pPr>
+            <w:r/>
+            <w:r>
+              <w:rPr>
+                <w:b w:val="0"/>
+                <w:sz w:val="19"/>
+              </w:rPr>
+              <w:t>SqlServers</w:t>
+            </w:r>
+          </w:p>
+        </w:tc>
+        <w:tc>
+          <w:tcPr>
+            <w:tcW w:type="dxa" w:w="1440"/>
+          </w:tcPr>
+          <w:p>
+            <w:pPr>
+              <w:spacing w:after="40" w:before="40"/>
+            </w:pPr>
+            <w:r/>
+            <w:r>
+              <w:rPr>
+                <w:b w:val="0"/>
+                <w:sz w:val="19"/>
+              </w:rPr>
+              <w:t>1</w:t>
+            </w:r>
+          </w:p>
+        </w:tc>
+        <w:tc>
+          <w:tcPr>
+            <w:tcW w:type="dxa" w:w="2592"/>
+          </w:tcPr>
+          <w:p>
+            <w:pPr>
+              <w:spacing w:after="40" w:before="40"/>
+            </w:pPr>
+            <w:r/>
+            <w:r>
+              <w:rPr>
+                <w:b w:val="0"/>
+                <w:sz w:val="19"/>
+              </w:rPr>
+              <w:t>Standard: ~€13/Server/Mon.</w:t>
+            </w:r>
+          </w:p>
+        </w:tc>
+      </w:tr>
+      <w:tr>
+        <w:tc>
+          <w:tcPr>
+            <w:tcW w:type="dxa" w:w="3312"/>
+          </w:tcPr>
+          <w:p>
+            <w:pPr>
+              <w:spacing w:after="40" w:before="40"/>
+            </w:pPr>
+            <w:r/>
+            <w:r>
+              <w:rPr>
+                <w:b w:val="0"/>
+                <w:sz w:val="19"/>
+              </w:rPr>
+              <w:t>Defender Pricing – SqlServerVMs</w:t>
+            </w:r>
+          </w:p>
+        </w:tc>
+        <w:tc>
+          <w:tcPr>
+            <w:tcW w:type="dxa" w:w="4176"/>
+          </w:tcPr>
+          <w:p>
+            <w:pPr>
+              <w:spacing w:after="40" w:before="40"/>
+            </w:pPr>
+            <w:r/>
+            <w:r>
+              <w:rPr>
+                <w:b w:val="0"/>
+                <w:sz w:val="19"/>
+              </w:rPr>
+              <w:t>SqlServerVirtualMachines</w:t>
+            </w:r>
+          </w:p>
+        </w:tc>
+        <w:tc>
+          <w:tcPr>
+            <w:tcW w:type="dxa" w:w="1440"/>
+          </w:tcPr>
+          <w:p>
+            <w:pPr>
+              <w:spacing w:after="40" w:before="40"/>
+            </w:pPr>
+            <w:r/>
+            <w:r>
+              <w:rPr>
+                <w:b w:val="0"/>
+                <w:sz w:val="19"/>
+              </w:rPr>
+              <w:t>1</w:t>
+            </w:r>
+          </w:p>
+        </w:tc>
+        <w:tc>
+          <w:tcPr>
+            <w:tcW w:type="dxa" w:w="2592"/>
+          </w:tcPr>
+          <w:p>
+            <w:pPr>
+              <w:spacing w:after="40" w:before="40"/>
+            </w:pPr>
+            <w:r/>
+            <w:r>
+              <w:rPr>
+                <w:b w:val="0"/>
+                <w:sz w:val="19"/>
+              </w:rPr>
+              <w:t>Standard: ~€13/Server/Mon.</w:t>
+            </w:r>
+          </w:p>
+        </w:tc>
+      </w:tr>
+      <w:tr>
+        <w:tc>
+          <w:tcPr>
+            <w:tcW w:type="dxa" w:w="3312"/>
+          </w:tcPr>
+          <w:p>
+            <w:pPr>
+              <w:spacing w:after="40" w:before="40"/>
+            </w:pPr>
+            <w:r/>
+            <w:r>
+              <w:rPr>
+                <w:b w:val="0"/>
+                <w:sz w:val="19"/>
+              </w:rPr>
+              <w:t>Defender Pricing – OSS Datenbanken</w:t>
+            </w:r>
+          </w:p>
+        </w:tc>
+        <w:tc>
+          <w:tcPr>
+            <w:tcW w:type="dxa" w:w="4176"/>
+          </w:tcPr>
+          <w:p>
+            <w:pPr>
+              <w:spacing w:after="40" w:before="40"/>
+            </w:pPr>
+            <w:r/>
+            <w:r>
+              <w:rPr>
+                <w:b w:val="0"/>
+                <w:sz w:val="19"/>
+              </w:rPr>
+              <w:t>OpenSourceRelationalDatabases</w:t>
+            </w:r>
+          </w:p>
+        </w:tc>
+        <w:tc>
+          <w:tcPr>
+            <w:tcW w:type="dxa" w:w="1440"/>
+          </w:tcPr>
+          <w:p>
+            <w:pPr>
+              <w:spacing w:after="40" w:before="40"/>
+            </w:pPr>
+            <w:r/>
+            <w:r>
+              <w:rPr>
+                <w:b w:val="0"/>
+                <w:sz w:val="19"/>
+              </w:rPr>
+              <w:t>1</w:t>
+            </w:r>
+          </w:p>
+        </w:tc>
+        <w:tc>
+          <w:tcPr>
+            <w:tcW w:type="dxa" w:w="2592"/>
+          </w:tcPr>
+          <w:p>
+            <w:pPr>
+              <w:spacing w:after="40" w:before="40"/>
+            </w:pPr>
+            <w:r/>
+            <w:r>
+              <w:rPr>
+                <w:b w:val="0"/>
+                <w:sz w:val="19"/>
+              </w:rPr>
+              <w:t>Standard: ~€13/Server/Mon.</w:t>
+            </w:r>
+          </w:p>
+        </w:tc>
+      </w:tr>
+      <w:tr>
+        <w:tc>
+          <w:tcPr>
+            <w:tcW w:type="dxa" w:w="3312"/>
+          </w:tcPr>
+          <w:p>
+            <w:pPr>
+              <w:spacing w:after="40" w:before="40"/>
+            </w:pPr>
+            <w:r/>
+            <w:r>
+              <w:rPr>
+                <w:b w:val="0"/>
+                <w:sz w:val="19"/>
+              </w:rPr>
+              <w:t>Defender Pricing – CosmosDB</w:t>
+            </w:r>
+          </w:p>
+        </w:tc>
+        <w:tc>
+          <w:tcPr>
+            <w:tcW w:type="dxa" w:w="4176"/>
+          </w:tcPr>
+          <w:p>
+            <w:pPr>
+              <w:spacing w:after="40" w:before="40"/>
+            </w:pPr>
+            <w:r/>
+            <w:r>
+              <w:rPr>
+                <w:b w:val="0"/>
+                <w:sz w:val="19"/>
+              </w:rPr>
+              <w:t>CosmosDbs</w:t>
+            </w:r>
+          </w:p>
+        </w:tc>
+        <w:tc>
+          <w:tcPr>
+            <w:tcW w:type="dxa" w:w="1440"/>
+          </w:tcPr>
+          <w:p>
+            <w:pPr>
+              <w:spacing w:after="40" w:before="40"/>
+            </w:pPr>
+            <w:r/>
+            <w:r>
+              <w:rPr>
+                <w:b w:val="0"/>
+                <w:sz w:val="19"/>
+              </w:rPr>
+              <w:t>1</w:t>
+            </w:r>
+          </w:p>
+        </w:tc>
+        <w:tc>
+          <w:tcPr>
+            <w:tcW w:type="dxa" w:w="2592"/>
+          </w:tcPr>
+          <w:p>
+            <w:pPr>
+              <w:spacing w:after="40" w:before="40"/>
+            </w:pPr>
+            <w:r/>
+            <w:r>
+              <w:rPr>
+                <w:b w:val="0"/>
+                <w:sz w:val="19"/>
+              </w:rPr>
+              <w:t>Standard: per RU</w:t>
+            </w:r>
+          </w:p>
+        </w:tc>
+      </w:tr>
+      <w:tr>
+        <w:tc>
+          <w:tcPr>
+            <w:tcW w:type="dxa" w:w="3312"/>
+          </w:tcPr>
+          <w:p>
+            <w:pPr>
+              <w:spacing w:after="40" w:before="40"/>
+            </w:pPr>
+            <w:r/>
+            <w:r>
+              <w:rPr>
+                <w:b w:val="0"/>
+                <w:sz w:val="19"/>
+              </w:rPr>
+              <w:t>Security Contact</w:t>
+            </w:r>
+          </w:p>
+        </w:tc>
+        <w:tc>
+          <w:tcPr>
+            <w:tcW w:type="dxa" w:w="4176"/>
+          </w:tcPr>
+          <w:p>
+            <w:pPr>
+              <w:spacing w:after="40" w:before="40"/>
+            </w:pPr>
+            <w:r/>
+            <w:r>
+              <w:rPr>
+                <w:b w:val="0"/>
+                <w:sz w:val="19"/>
+              </w:rPr>
+              <w:t>default</w:t>
+            </w:r>
+          </w:p>
+        </w:tc>
+        <w:tc>
+          <w:tcPr>
+            <w:tcW w:type="dxa" w:w="1440"/>
+          </w:tcPr>
+          <w:p>
+            <w:pPr>
+              <w:spacing w:after="40" w:before="40"/>
+            </w:pPr>
+            <w:r/>
+            <w:r>
+              <w:rPr>
+                <w:b w:val="0"/>
+                <w:sz w:val="19"/>
+              </w:rPr>
+              <w:t>1</w:t>
+            </w:r>
+          </w:p>
+        </w:tc>
+        <w:tc>
+          <w:tcPr>
+            <w:tcW w:type="dxa" w:w="2592"/>
+          </w:tcPr>
+          <w:p>
+            <w:pPr>
+              <w:spacing w:after="40" w:before="40"/>
+            </w:pPr>
+            <w:r/>
+            <w:r>
+              <w:rPr>
+                <w:b w:val="0"/>
+                <w:sz w:val="19"/>
+              </w:rPr>
+              <w:t>Kostenlos</w:t>
+            </w:r>
+          </w:p>
+        </w:tc>
+      </w:tr>
+      <w:tr>
+        <w:tc>
+          <w:tcPr>
+            <w:tcW w:type="dxa" w:w="3312"/>
+          </w:tcPr>
+          <w:p>
+            <w:pPr>
+              <w:spacing w:after="40" w:before="40"/>
+            </w:pPr>
+            <w:r/>
+            <w:r>
+              <w:rPr>
+                <w:b w:val="0"/>
+                <w:sz w:val="19"/>
+              </w:rPr>
+              <w:t>Diagnostic Settings (Activity-Log → LAW)</w:t>
+            </w:r>
+          </w:p>
+        </w:tc>
+        <w:tc>
+          <w:tcPr>
+            <w:tcW w:type="dxa" w:w="4176"/>
+          </w:tcPr>
+          <w:p>
+            <w:pPr>
+              <w:spacing w:after="40" w:before="40"/>
+            </w:pPr>
+            <w:r/>
+            <w:r>
+              <w:rPr>
+                <w:b w:val="0"/>
+                <w:sz w:val="19"/>
+              </w:rPr>
+              <w:t>alz-activitylog-to-law</w:t>
+            </w:r>
+          </w:p>
+        </w:tc>
+        <w:tc>
+          <w:tcPr>
+            <w:tcW w:type="dxa" w:w="1440"/>
+          </w:tcPr>
+          <w:p>
+            <w:pPr>
+              <w:spacing w:after="40" w:before="40"/>
+            </w:pPr>
+            <w:r/>
+            <w:r>
+              <w:rPr>
+                <w:b w:val="0"/>
+                <w:sz w:val="19"/>
+              </w:rPr>
+              <w:t>1</w:t>
+            </w:r>
+          </w:p>
+        </w:tc>
+        <w:tc>
+          <w:tcPr>
+            <w:tcW w:type="dxa" w:w="2592"/>
+          </w:tcPr>
+          <w:p>
+            <w:pPr>
+              <w:spacing w:after="40" w:before="40"/>
+            </w:pPr>
+            <w:r/>
+            <w:r>
+              <w:rPr>
+                <w:b w:val="0"/>
+                <w:sz w:val="19"/>
+              </w:rPr>
+              <w:t>Im LAW enthalten</w:t>
+            </w:r>
+          </w:p>
+        </w:tc>
+      </w:tr>
+    </w:tbl>
+    <w:p/>
+    <w:p>
+      <w:pPr>
+        <w:pStyle w:val="Heading2"/>
+      </w:pPr>
+      <w:r>
+        <w:t>5.4 Hub Networking (Connectivity-Subscription)</w:t>
+      </w:r>
+    </w:p>
+    <w:tbl>
+      <w:tblPr>
+        <w:tblStyle w:val="LightGrid-Accent1"/>
+        <w:tblW w:type="auto" w:w="0"/>
+        <w:jc w:val="center"/>
+        <w:tblLook w:firstColumn="1" w:firstRow="1" w:lastColumn="0" w:lastRow="0" w:noHBand="0" w:noVBand="1" w:val="04A0"/>
+      </w:tblPr>
+      <w:tblGrid>
+        <w:gridCol w:w="2160"/>
+        <w:gridCol w:w="2160"/>
+        <w:gridCol w:w="2160"/>
+        <w:gridCol w:w="2160"/>
+      </w:tblGrid>
+      <w:tr>
+        <w:tc>
+          <w:tcPr>
+            <w:tcW w:type="dxa" w:w="3312"/>
+            <w:shd w:val="clear" w:color="auto" w:fill="0078D4"/>
+          </w:tcPr>
+          <w:p>
+            <w:pPr>
+              <w:spacing w:after="40" w:before="40"/>
+            </w:pPr>
+            <w:r/>
+            <w:r>
+              <w:rPr>
+                <w:b/>
+                <w:color w:val="FFFFFF"/>
+                <w:sz w:val="19"/>
+              </w:rPr>
+              <w:t>Ressourcentyp</w:t>
+            </w:r>
+          </w:p>
+        </w:tc>
+        <w:tc>
+          <w:tcPr>
+            <w:tcW w:type="dxa" w:w="4608"/>
+            <w:shd w:val="clear" w:color="auto" w:fill="0078D4"/>
+          </w:tcPr>
+          <w:p>
+            <w:pPr>
+              <w:spacing w:after="40" w:before="40"/>
+            </w:pPr>
+            <w:r/>
+            <w:r>
+              <w:rPr>
+                <w:b/>
+                <w:color w:val="FFFFFF"/>
+                <w:sz w:val="19"/>
+              </w:rPr>
+              <w:t>Name / Konvention</w:t>
+            </w:r>
+          </w:p>
+        </w:tc>
+        <w:tc>
+          <w:tcPr>
+            <w:tcW w:type="dxa" w:w="1008"/>
+            <w:shd w:val="clear" w:color="auto" w:fill="0078D4"/>
+          </w:tcPr>
+          <w:p>
+            <w:pPr>
+              <w:spacing w:after="40" w:before="40"/>
+            </w:pPr>
+            <w:r/>
+            <w:r>
+              <w:rPr>
+                <w:b/>
+                <w:color w:val="FFFFFF"/>
+                <w:sz w:val="19"/>
+              </w:rPr>
+              <w:t>Anzahl</w:t>
+            </w:r>
+          </w:p>
+        </w:tc>
+        <w:tc>
+          <w:tcPr>
+            <w:tcW w:type="dxa" w:w="2592"/>
+            <w:shd w:val="clear" w:color="auto" w:fill="0078D4"/>
+          </w:tcPr>
+          <w:p>
+            <w:pPr>
+              <w:spacing w:after="40" w:before="40"/>
+            </w:pPr>
+            <w:r/>
+            <w:r>
+              <w:rPr>
+                <w:b/>
+                <w:color w:val="FFFFFF"/>
+                <w:sz w:val="19"/>
+              </w:rPr>
+              <w:t>Kosten</w:t>
+            </w:r>
+          </w:p>
+        </w:tc>
+      </w:tr>
+      <w:tr>
+        <w:tc>
+          <w:tcPr>
+            <w:tcW w:type="dxa" w:w="3312"/>
+          </w:tcPr>
+          <w:p>
+            <w:pPr>
+              <w:spacing w:after="40" w:before="40"/>
+            </w:pPr>
+            <w:r/>
+            <w:r>
+              <w:rPr>
+                <w:b w:val="0"/>
+                <w:sz w:val="19"/>
+              </w:rPr>
+              <w:t>Resource Group</w:t>
+            </w:r>
+          </w:p>
+        </w:tc>
+        <w:tc>
+          <w:tcPr>
+            <w:tcW w:type="dxa" w:w="4608"/>
+          </w:tcPr>
+          <w:p>
+            <w:pPr>
+              <w:spacing w:after="40" w:before="40"/>
+            </w:pPr>
+            <w:r/>
+            <w:r>
+              <w:rPr>
+                <w:b w:val="0"/>
+                <w:sz w:val="19"/>
+              </w:rPr>
+              <w:t>rg-alz-conn-germanywestcentral</w:t>
+            </w:r>
+          </w:p>
+        </w:tc>
+        <w:tc>
+          <w:tcPr>
+            <w:tcW w:type="dxa" w:w="1008"/>
+          </w:tcPr>
+          <w:p>
+            <w:pPr>
+              <w:spacing w:after="40" w:before="40"/>
+            </w:pPr>
+            <w:r/>
+            <w:r>
+              <w:rPr>
+                <w:b w:val="0"/>
+                <w:sz w:val="19"/>
+              </w:rPr>
+              <w:t>1</w:t>
+            </w:r>
+          </w:p>
+        </w:tc>
+        <w:tc>
+          <w:tcPr>
+            <w:tcW w:type="dxa" w:w="2592"/>
+          </w:tcPr>
+          <w:p>
+            <w:pPr>
+              <w:spacing w:after="40" w:before="40"/>
+            </w:pPr>
+            <w:r/>
+            <w:r>
+              <w:rPr>
+                <w:b w:val="0"/>
+                <w:sz w:val="19"/>
+              </w:rPr>
+              <w:t>Kostenlos</w:t>
+            </w:r>
+          </w:p>
+        </w:tc>
+      </w:tr>
+      <w:tr>
+        <w:tc>
+          <w:tcPr>
+            <w:tcW w:type="dxa" w:w="3312"/>
+          </w:tcPr>
+          <w:p>
+            <w:pPr>
+              <w:spacing w:after="40" w:before="40"/>
+            </w:pPr>
+            <w:r/>
+            <w:r>
+              <w:rPr>
+                <w:b w:val="0"/>
+                <w:sz w:val="19"/>
+              </w:rPr>
+              <w:t>Virtual Network (Hub primär)</w:t>
+            </w:r>
+          </w:p>
+        </w:tc>
+        <w:tc>
+          <w:tcPr>
+            <w:tcW w:type="dxa" w:w="4608"/>
+          </w:tcPr>
+          <w:p>
+            <w:pPr>
+              <w:spacing w:after="40" w:before="40"/>
+            </w:pPr>
+            <w:r/>
+            <w:r>
+              <w:rPr>
+                <w:b w:val="0"/>
+                <w:sz w:val="19"/>
+              </w:rPr>
+              <w:t>vnet-alz-germanywestcentral (10.0.0.0/22)</w:t>
+            </w:r>
+          </w:p>
+        </w:tc>
+        <w:tc>
+          <w:tcPr>
+            <w:tcW w:type="dxa" w:w="1008"/>
+          </w:tcPr>
+          <w:p>
+            <w:pPr>
+              <w:spacing w:after="40" w:before="40"/>
+            </w:pPr>
+            <w:r/>
+            <w:r>
+              <w:rPr>
+                <w:b w:val="0"/>
+                <w:sz w:val="19"/>
+              </w:rPr>
+              <w:t>1</w:t>
+            </w:r>
+          </w:p>
+        </w:tc>
+        <w:tc>
+          <w:tcPr>
+            <w:tcW w:type="dxa" w:w="2592"/>
+          </w:tcPr>
+          <w:p>
+            <w:pPr>
+              <w:spacing w:after="40" w:before="40"/>
+            </w:pPr>
+            <w:r/>
+            <w:r>
+              <w:rPr>
+                <w:b w:val="0"/>
+                <w:sz w:val="19"/>
+              </w:rPr>
+              <w:t>Kostenlos</w:t>
+            </w:r>
+          </w:p>
+        </w:tc>
+      </w:tr>
+      <w:tr>
+        <w:tc>
+          <w:tcPr>
+            <w:tcW w:type="dxa" w:w="3312"/>
+          </w:tcPr>
+          <w:p>
+            <w:pPr>
+              <w:spacing w:after="40" w:before="40"/>
+            </w:pPr>
+            <w:r/>
+            <w:r>
+              <w:rPr>
+                <w:b w:val="0"/>
+                <w:sz w:val="19"/>
+              </w:rPr>
+              <w:t>Virtual Network (Hub sekundär)</w:t>
+            </w:r>
+          </w:p>
+        </w:tc>
+        <w:tc>
+          <w:tcPr>
+            <w:tcW w:type="dxa" w:w="4608"/>
+          </w:tcPr>
+          <w:p>
+            <w:pPr>
+              <w:spacing w:after="40" w:before="40"/>
+            </w:pPr>
+            <w:r/>
+            <w:r>
+              <w:rPr>
+                <w:b w:val="0"/>
+                <w:sz w:val="19"/>
+              </w:rPr>
+              <w:t>vnet-alz-northeurope (10.1.0.0/22)</w:t>
+            </w:r>
+          </w:p>
+        </w:tc>
+        <w:tc>
+          <w:tcPr>
+            <w:tcW w:type="dxa" w:w="1008"/>
+          </w:tcPr>
+          <w:p>
+            <w:pPr>
+              <w:spacing w:after="40" w:before="40"/>
+            </w:pPr>
+            <w:r/>
+            <w:r>
+              <w:rPr>
+                <w:b w:val="0"/>
+                <w:sz w:val="19"/>
+              </w:rPr>
+              <w:t>1</w:t>
+            </w:r>
+          </w:p>
+        </w:tc>
+        <w:tc>
+          <w:tcPr>
+            <w:tcW w:type="dxa" w:w="2592"/>
+          </w:tcPr>
+          <w:p>
+            <w:pPr>
+              <w:spacing w:after="40" w:before="40"/>
+            </w:pPr>
+            <w:r/>
+            <w:r>
+              <w:rPr>
+                <w:b w:val="0"/>
+                <w:sz w:val="19"/>
+              </w:rPr>
+              <w:t>Kostenlos</w:t>
+            </w:r>
+          </w:p>
+        </w:tc>
+      </w:tr>
+      <w:tr>
+        <w:tc>
+          <w:tcPr>
+            <w:tcW w:type="dxa" w:w="3312"/>
+          </w:tcPr>
+          <w:p>
+            <w:pPr>
+              <w:spacing w:after="40" w:before="40"/>
+            </w:pPr>
+            <w:r/>
+            <w:r>
+              <w:rPr>
+                <w:b w:val="0"/>
+                <w:sz w:val="19"/>
+              </w:rPr>
+              <w:t>Azure Firewall</w:t>
+            </w:r>
+          </w:p>
+        </w:tc>
+        <w:tc>
+          <w:tcPr>
+            <w:tcW w:type="dxa" w:w="4608"/>
+          </w:tcPr>
+          <w:p>
+            <w:pPr>
+              <w:spacing w:after="40" w:before="40"/>
+            </w:pPr>
+            <w:r/>
+            <w:r>
+              <w:rPr>
+                <w:b w:val="0"/>
+                <w:sz w:val="19"/>
+              </w:rPr>
+              <w:t>afw-alz-germanywestcentral</w:t>
+            </w:r>
+          </w:p>
+        </w:tc>
+        <w:tc>
+          <w:tcPr>
+            <w:tcW w:type="dxa" w:w="1008"/>
+          </w:tcPr>
+          <w:p>
+            <w:pPr>
+              <w:spacing w:after="40" w:before="40"/>
+            </w:pPr>
+            <w:r/>
+            <w:r>
+              <w:rPr>
+                <w:b w:val="0"/>
+                <w:sz w:val="19"/>
+              </w:rPr>
+              <w:t>1</w:t>
+            </w:r>
+          </w:p>
+        </w:tc>
+        <w:tc>
+          <w:tcPr>
+            <w:tcW w:type="dxa" w:w="2592"/>
+          </w:tcPr>
+          <w:p>
+            <w:pPr>
+              <w:spacing w:after="40" w:before="40"/>
+            </w:pPr>
+            <w:r/>
+            <w:r>
+              <w:rPr>
+                <w:b w:val="0"/>
+                <w:sz w:val="19"/>
+              </w:rPr>
+              <w:t>~€1.100/Monat</w:t>
+            </w:r>
+          </w:p>
+        </w:tc>
+      </w:tr>
+      <w:tr>
+        <w:tc>
+          <w:tcPr>
+            <w:tcW w:type="dxa" w:w="3312"/>
+          </w:tcPr>
+          <w:p>
+            <w:pPr>
+              <w:spacing w:after="40" w:before="40"/>
+            </w:pPr>
+            <w:r/>
+            <w:r>
+              <w:rPr>
+                <w:b w:val="0"/>
+                <w:sz w:val="19"/>
+              </w:rPr>
+              <w:t>Firewall Policy</w:t>
+            </w:r>
+          </w:p>
+        </w:tc>
+        <w:tc>
+          <w:tcPr>
+            <w:tcW w:type="dxa" w:w="4608"/>
+          </w:tcPr>
+          <w:p>
+            <w:pPr>
+              <w:spacing w:after="40" w:before="40"/>
+            </w:pPr>
+            <w:r/>
+            <w:r>
+              <w:rPr>
+                <w:b w:val="0"/>
+                <w:sz w:val="19"/>
+              </w:rPr>
+              <w:t>afwp-alz-germanywestcentral</w:t>
+            </w:r>
+          </w:p>
+        </w:tc>
+        <w:tc>
+          <w:tcPr>
+            <w:tcW w:type="dxa" w:w="1008"/>
+          </w:tcPr>
+          <w:p>
+            <w:pPr>
+              <w:spacing w:after="40" w:before="40"/>
+            </w:pPr>
+            <w:r/>
+            <w:r>
+              <w:rPr>
+                <w:b w:val="0"/>
+                <w:sz w:val="19"/>
+              </w:rPr>
+              <w:t>1</w:t>
+            </w:r>
+          </w:p>
+        </w:tc>
+        <w:tc>
+          <w:tcPr>
+            <w:tcW w:type="dxa" w:w="2592"/>
+          </w:tcPr>
+          <w:p>
+            <w:pPr>
+              <w:spacing w:after="40" w:before="40"/>
+            </w:pPr>
+            <w:r/>
+            <w:r>
+              <w:rPr>
+                <w:b w:val="0"/>
+                <w:sz w:val="19"/>
+              </w:rPr>
+              <w:t>Kostenlos</w:t>
+            </w:r>
+          </w:p>
+        </w:tc>
+      </w:tr>
+      <w:tr>
+        <w:tc>
+          <w:tcPr>
+            <w:tcW w:type="dxa" w:w="3312"/>
+          </w:tcPr>
+          <w:p>
+            <w:pPr>
+              <w:spacing w:after="40" w:before="40"/>
+            </w:pPr>
+            <w:r/>
+            <w:r>
+              <w:rPr>
+                <w:b w:val="0"/>
+                <w:sz w:val="19"/>
+              </w:rPr>
+              <w:t>Azure Bastion</w:t>
+            </w:r>
+          </w:p>
+        </w:tc>
+        <w:tc>
+          <w:tcPr>
+            <w:tcW w:type="dxa" w:w="4608"/>
+          </w:tcPr>
+          <w:p>
+            <w:pPr>
+              <w:spacing w:after="40" w:before="40"/>
+            </w:pPr>
+            <w:r/>
+            <w:r>
+              <w:rPr>
+                <w:b w:val="0"/>
+                <w:sz w:val="19"/>
+              </w:rPr>
+              <w:t>bas-alz-germanywestcentral</w:t>
+            </w:r>
+          </w:p>
+        </w:tc>
+        <w:tc>
+          <w:tcPr>
+            <w:tcW w:type="dxa" w:w="1008"/>
+          </w:tcPr>
+          <w:p>
+            <w:pPr>
+              <w:spacing w:after="40" w:before="40"/>
+            </w:pPr>
+            <w:r/>
+            <w:r>
+              <w:rPr>
+                <w:b w:val="0"/>
+                <w:sz w:val="19"/>
+              </w:rPr>
+              <w:t>1</w:t>
+            </w:r>
+          </w:p>
+        </w:tc>
+        <w:tc>
+          <w:tcPr>
+            <w:tcW w:type="dxa" w:w="2592"/>
+          </w:tcPr>
+          <w:p>
+            <w:pPr>
+              <w:spacing w:after="40" w:before="40"/>
+            </w:pPr>
+            <w:r/>
+            <w:r>
+              <w:rPr>
+                <w:b w:val="0"/>
+                <w:sz w:val="19"/>
+              </w:rPr>
+              <w:t>~€120/Monat</w:t>
+            </w:r>
+          </w:p>
+        </w:tc>
+      </w:tr>
+      <w:tr>
+        <w:tc>
+          <w:tcPr>
+            <w:tcW w:type="dxa" w:w="3312"/>
+          </w:tcPr>
+          <w:p>
+            <w:pPr>
+              <w:spacing w:after="40" w:before="40"/>
+            </w:pPr>
+            <w:r/>
+            <w:r>
+              <w:rPr>
+                <w:b w:val="0"/>
+                <w:sz w:val="19"/>
+              </w:rPr>
+              <w:t>Public IP – Firewall</w:t>
+            </w:r>
+          </w:p>
+        </w:tc>
+        <w:tc>
+          <w:tcPr>
+            <w:tcW w:type="dxa" w:w="4608"/>
+          </w:tcPr>
+          <w:p>
+            <w:pPr>
+              <w:spacing w:after="40" w:before="40"/>
+            </w:pPr>
+            <w:r/>
+            <w:r>
+              <w:rPr>
+                <w:b w:val="0"/>
+                <w:sz w:val="19"/>
+              </w:rPr>
+              <w:t>pip-afw-alz-germanywestcentral</w:t>
+            </w:r>
+          </w:p>
+        </w:tc>
+        <w:tc>
+          <w:tcPr>
+            <w:tcW w:type="dxa" w:w="1008"/>
+          </w:tcPr>
+          <w:p>
+            <w:pPr>
+              <w:spacing w:after="40" w:before="40"/>
+            </w:pPr>
+            <w:r/>
+            <w:r>
+              <w:rPr>
+                <w:b w:val="0"/>
+                <w:sz w:val="19"/>
+              </w:rPr>
+              <w:t>1</w:t>
+            </w:r>
+          </w:p>
+        </w:tc>
+        <w:tc>
+          <w:tcPr>
+            <w:tcW w:type="dxa" w:w="2592"/>
+          </w:tcPr>
+          <w:p>
+            <w:pPr>
+              <w:spacing w:after="40" w:before="40"/>
+            </w:pPr>
+            <w:r/>
+            <w:r>
+              <w:rPr>
+                <w:b w:val="0"/>
+                <w:sz w:val="19"/>
+              </w:rPr>
+              <w:t>~€3/Monat</w:t>
+            </w:r>
+          </w:p>
+        </w:tc>
+      </w:tr>
+      <w:tr>
+        <w:tc>
+          <w:tcPr>
+            <w:tcW w:type="dxa" w:w="3312"/>
+          </w:tcPr>
+          <w:p>
+            <w:pPr>
+              <w:spacing w:after="40" w:before="40"/>
+            </w:pPr>
+            <w:r/>
+            <w:r>
+              <w:rPr>
+                <w:b w:val="0"/>
+                <w:sz w:val="19"/>
+              </w:rPr>
+              <w:t>Public IP – Bastion</w:t>
+            </w:r>
+          </w:p>
+        </w:tc>
+        <w:tc>
+          <w:tcPr>
+            <w:tcW w:type="dxa" w:w="4608"/>
+          </w:tcPr>
+          <w:p>
+            <w:pPr>
+              <w:spacing w:after="40" w:before="40"/>
+            </w:pPr>
+            <w:r/>
+            <w:r>
+              <w:rPr>
+                <w:b w:val="0"/>
+                <w:sz w:val="19"/>
+              </w:rPr>
+              <w:t>pip-bas-alz-germanywestcentral</w:t>
+            </w:r>
+          </w:p>
+        </w:tc>
+        <w:tc>
+          <w:tcPr>
+            <w:tcW w:type="dxa" w:w="1008"/>
+          </w:tcPr>
+          <w:p>
+            <w:pPr>
+              <w:spacing w:after="40" w:before="40"/>
+            </w:pPr>
+            <w:r/>
+            <w:r>
+              <w:rPr>
+                <w:b w:val="0"/>
+                <w:sz w:val="19"/>
+              </w:rPr>
+              <w:t>1</w:t>
+            </w:r>
+          </w:p>
+        </w:tc>
+        <w:tc>
+          <w:tcPr>
+            <w:tcW w:type="dxa" w:w="2592"/>
+          </w:tcPr>
+          <w:p>
+            <w:pPr>
+              <w:spacing w:after="40" w:before="40"/>
+            </w:pPr>
+            <w:r/>
+            <w:r>
+              <w:rPr>
+                <w:b w:val="0"/>
+                <w:sz w:val="19"/>
+              </w:rPr>
+              <w:t>~€3/Monat</w:t>
+            </w:r>
+          </w:p>
+        </w:tc>
+      </w:tr>
+      <w:tr>
+        <w:tc>
+          <w:tcPr>
+            <w:tcW w:type="dxa" w:w="3312"/>
+          </w:tcPr>
+          <w:p>
+            <w:pPr>
+              <w:spacing w:after="40" w:before="40"/>
+            </w:pPr>
+            <w:r/>
+            <w:r>
+              <w:rPr>
+                <w:b w:val="0"/>
+                <w:sz w:val="19"/>
+              </w:rPr>
+              <w:t>VNet Peering Hub↔Hub</w:t>
+            </w:r>
+          </w:p>
+        </w:tc>
+        <w:tc>
+          <w:tcPr>
+            <w:tcW w:type="dxa" w:w="4608"/>
+          </w:tcPr>
+          <w:p>
+            <w:pPr>
+              <w:spacing w:after="40" w:before="40"/>
+            </w:pPr>
+            <w:r/>
+            <w:r>
+              <w:rPr>
+                <w:b w:val="0"/>
+                <w:sz w:val="19"/>
+              </w:rPr>
+              <w:t>Hub GWC ↔ Hub NE (bidirektional)</w:t>
+            </w:r>
+          </w:p>
+        </w:tc>
+        <w:tc>
+          <w:tcPr>
+            <w:tcW w:type="dxa" w:w="1008"/>
+          </w:tcPr>
+          <w:p>
+            <w:pPr>
+              <w:spacing w:after="40" w:before="40"/>
+            </w:pPr>
+            <w:r/>
+            <w:r>
+              <w:rPr>
+                <w:b w:val="0"/>
+                <w:sz w:val="19"/>
+              </w:rPr>
+              <w:t>2</w:t>
+            </w:r>
+          </w:p>
+        </w:tc>
+        <w:tc>
+          <w:tcPr>
+            <w:tcW w:type="dxa" w:w="2592"/>
+          </w:tcPr>
+          <w:p>
+            <w:pPr>
+              <w:spacing w:after="40" w:before="40"/>
+            </w:pPr>
+            <w:r/>
+            <w:r>
+              <w:rPr>
+                <w:b w:val="0"/>
+                <w:sz w:val="19"/>
+              </w:rPr>
+              <w:t>Gering (Datenübertragung)</w:t>
+            </w:r>
+          </w:p>
+        </w:tc>
+      </w:tr>
+      <w:tr>
+        <w:tc>
+          <w:tcPr>
+            <w:tcW w:type="dxa" w:w="3312"/>
+          </w:tcPr>
+          <w:p>
+            <w:pPr>
+              <w:spacing w:after="40" w:before="40"/>
+            </w:pPr>
+            <w:r/>
+            <w:r>
+              <w:rPr>
+                <w:b w:val="0"/>
+                <w:sz w:val="19"/>
+              </w:rPr>
+              <w:t>Private DNS Zone</w:t>
+            </w:r>
+          </w:p>
+        </w:tc>
+        <w:tc>
+          <w:tcPr>
+            <w:tcW w:type="dxa" w:w="4608"/>
+          </w:tcPr>
+          <w:p>
+            <w:pPr>
+              <w:spacing w:after="40" w:before="40"/>
+            </w:pPr>
+            <w:r/>
+            <w:r>
+              <w:rPr>
+                <w:b w:val="0"/>
+                <w:sz w:val="19"/>
+              </w:rPr>
+              <w:t>privatelink.*.azure.com / privatelink.*.core.*</w:t>
+            </w:r>
+          </w:p>
+        </w:tc>
+        <w:tc>
+          <w:tcPr>
+            <w:tcW w:type="dxa" w:w="1008"/>
+          </w:tcPr>
+          <w:p>
+            <w:pPr>
+              <w:spacing w:after="40" w:before="40"/>
+            </w:pPr>
+            <w:r/>
+            <w:r>
+              <w:rPr>
+                <w:b w:val="0"/>
+                <w:sz w:val="19"/>
+              </w:rPr>
+              <w:t>37</w:t>
+            </w:r>
+          </w:p>
+        </w:tc>
+        <w:tc>
+          <w:tcPr>
+            <w:tcW w:type="dxa" w:w="2592"/>
+          </w:tcPr>
+          <w:p>
+            <w:pPr>
+              <w:spacing w:after="40" w:before="40"/>
+            </w:pPr>
+            <w:r/>
+            <w:r>
+              <w:rPr>
+                <w:b w:val="0"/>
+                <w:sz w:val="19"/>
+              </w:rPr>
+              <w:t>~€0,90/Zone/Mon.</w:t>
+            </w:r>
+          </w:p>
+        </w:tc>
+      </w:tr>
+      <w:tr>
+        <w:tc>
+          <w:tcPr>
+            <w:tcW w:type="dxa" w:w="3312"/>
+          </w:tcPr>
+          <w:p>
+            <w:pPr>
+              <w:spacing w:after="40" w:before="40"/>
+            </w:pPr>
+            <w:r/>
+            <w:r>
+              <w:rPr>
+                <w:b w:val="0"/>
+                <w:sz w:val="19"/>
+              </w:rPr>
+              <w:t>DNS Private Resolver (optional)</w:t>
+            </w:r>
+          </w:p>
+        </w:tc>
+        <w:tc>
+          <w:tcPr>
+            <w:tcW w:type="dxa" w:w="4608"/>
+          </w:tcPr>
+          <w:p>
+            <w:pPr>
+              <w:spacing w:after="40" w:before="40"/>
+            </w:pPr>
+            <w:r/>
+            <w:r>
+              <w:rPr>
+                <w:b w:val="0"/>
+                <w:sz w:val="19"/>
+              </w:rPr>
+              <w:t>dnspr-alz-germanywestcentral</w:t>
+            </w:r>
+          </w:p>
+        </w:tc>
+        <w:tc>
+          <w:tcPr>
+            <w:tcW w:type="dxa" w:w="1008"/>
+          </w:tcPr>
+          <w:p>
+            <w:pPr>
+              <w:spacing w:after="40" w:before="40"/>
+            </w:pPr>
+            <w:r/>
+            <w:r>
+              <w:rPr>
+                <w:b w:val="0"/>
+                <w:sz w:val="19"/>
+              </w:rPr>
+              <w:t>0–1</w:t>
+            </w:r>
+          </w:p>
+        </w:tc>
+        <w:tc>
+          <w:tcPr>
+            <w:tcW w:type="dxa" w:w="2592"/>
+          </w:tcPr>
+          <w:p>
+            <w:pPr>
+              <w:spacing w:after="40" w:before="40"/>
+            </w:pPr>
+            <w:r/>
+            <w:r>
+              <w:rPr>
+                <w:b w:val="0"/>
+                <w:sz w:val="19"/>
+              </w:rPr>
+              <w:t>~€25/Monat (bei Aktivierung)</w:t>
+            </w:r>
+          </w:p>
+        </w:tc>
+      </w:tr>
+    </w:tbl>
+    <w:p/>
+    <w:p>
+      <w:pPr>
+        <w:pStyle w:val="Heading2"/>
+      </w:pPr>
+      <w:r>
+        <w:t>5.5 Spoke Networking (Workload-Subscription, je Landing Zone)</w:t>
+      </w:r>
+    </w:p>
+    <w:tbl>
+      <w:tblPr>
+        <w:tblStyle w:val="LightGrid-Accent1"/>
+        <w:tblW w:type="auto" w:w="0"/>
+        <w:jc w:val="center"/>
+        <w:tblLook w:firstColumn="1" w:firstRow="1" w:lastColumn="0" w:lastRow="0" w:noHBand="0" w:noVBand="1" w:val="04A0"/>
+      </w:tblPr>
+      <w:tblGrid>
+        <w:gridCol w:w="2160"/>
+        <w:gridCol w:w="2160"/>
+        <w:gridCol w:w="2160"/>
+        <w:gridCol w:w="2160"/>
+      </w:tblGrid>
+      <w:tr>
+        <w:tc>
+          <w:tcPr>
+            <w:tcW w:type="dxa" w:w="3312"/>
+            <w:shd w:val="clear" w:color="auto" w:fill="0078D4"/>
+          </w:tcPr>
+          <w:p>
+            <w:pPr>
+              <w:spacing w:after="40" w:before="40"/>
+            </w:pPr>
+            <w:r/>
+            <w:r>
+              <w:rPr>
+                <w:b/>
+                <w:color w:val="FFFFFF"/>
+                <w:sz w:val="19"/>
+              </w:rPr>
+              <w:t>Ressourcentyp</w:t>
+            </w:r>
+          </w:p>
+        </w:tc>
+        <w:tc>
+          <w:tcPr>
+            <w:tcW w:type="dxa" w:w="4608"/>
+            <w:shd w:val="clear" w:color="auto" w:fill="0078D4"/>
+          </w:tcPr>
+          <w:p>
+            <w:pPr>
+              <w:spacing w:after="40" w:before="40"/>
+            </w:pPr>
+            <w:r/>
+            <w:r>
+              <w:rPr>
+                <w:b/>
+                <w:color w:val="FFFFFF"/>
+                <w:sz w:val="19"/>
+              </w:rPr>
+              <w:t>Name / Konvention</w:t>
+            </w:r>
+          </w:p>
+        </w:tc>
+        <w:tc>
+          <w:tcPr>
+            <w:tcW w:type="dxa" w:w="1008"/>
+            <w:shd w:val="clear" w:color="auto" w:fill="0078D4"/>
+          </w:tcPr>
+          <w:p>
+            <w:pPr>
+              <w:spacing w:after="40" w:before="40"/>
+            </w:pPr>
+            <w:r/>
+            <w:r>
+              <w:rPr>
+                <w:b/>
+                <w:color w:val="FFFFFF"/>
+                <w:sz w:val="19"/>
+              </w:rPr>
+              <w:t>Anzahl</w:t>
+            </w:r>
+          </w:p>
+        </w:tc>
+        <w:tc>
+          <w:tcPr>
+            <w:tcW w:type="dxa" w:w="2592"/>
+            <w:shd w:val="clear" w:color="auto" w:fill="0078D4"/>
+          </w:tcPr>
+          <w:p>
+            <w:pPr>
+              <w:spacing w:after="40" w:before="40"/>
+            </w:pPr>
+            <w:r/>
+            <w:r>
+              <w:rPr>
+                <w:b/>
+                <w:color w:val="FFFFFF"/>
+                <w:sz w:val="19"/>
+              </w:rPr>
+              <w:t>Kosten</w:t>
+            </w:r>
+          </w:p>
+        </w:tc>
+      </w:tr>
+      <w:tr>
+        <w:tc>
+          <w:tcPr>
+            <w:tcW w:type="dxa" w:w="3312"/>
+          </w:tcPr>
+          <w:p>
+            <w:pPr>
+              <w:spacing w:after="40" w:before="40"/>
+            </w:pPr>
+            <w:r/>
+            <w:r>
+              <w:rPr>
+                <w:b w:val="0"/>
+                <w:sz w:val="19"/>
+              </w:rPr>
+              <w:t>Resource Group</w:t>
+            </w:r>
+          </w:p>
+        </w:tc>
+        <w:tc>
+          <w:tcPr>
+            <w:tcW w:type="dxa" w:w="4608"/>
+          </w:tcPr>
+          <w:p>
+            <w:pPr>
+              <w:spacing w:after="40" w:before="40"/>
+            </w:pPr>
+            <w:r/>
+            <w:r>
+              <w:rPr>
+                <w:b w:val="0"/>
+                <w:sz w:val="19"/>
+              </w:rPr>
+              <w:t>rg-alz-spoke-&lt;workload&gt;-&lt;region&gt;</w:t>
+            </w:r>
+          </w:p>
+        </w:tc>
+        <w:tc>
+          <w:tcPr>
+            <w:tcW w:type="dxa" w:w="1008"/>
+          </w:tcPr>
+          <w:p>
+            <w:pPr>
+              <w:spacing w:after="40" w:before="40"/>
+            </w:pPr>
+            <w:r/>
+            <w:r>
+              <w:rPr>
+                <w:b w:val="0"/>
+                <w:sz w:val="19"/>
+              </w:rPr>
+              <w:t>1</w:t>
+            </w:r>
+          </w:p>
+        </w:tc>
+        <w:tc>
+          <w:tcPr>
+            <w:tcW w:type="dxa" w:w="2592"/>
+          </w:tcPr>
+          <w:p>
+            <w:pPr>
+              <w:spacing w:after="40" w:before="40"/>
+            </w:pPr>
+            <w:r/>
+            <w:r>
+              <w:rPr>
+                <w:b w:val="0"/>
+                <w:sz w:val="19"/>
+              </w:rPr>
+              <w:t>Kostenlos</w:t>
+            </w:r>
+          </w:p>
+        </w:tc>
+      </w:tr>
+      <w:tr>
+        <w:tc>
+          <w:tcPr>
+            <w:tcW w:type="dxa" w:w="3312"/>
+          </w:tcPr>
+          <w:p>
+            <w:pPr>
+              <w:spacing w:after="40" w:before="40"/>
+            </w:pPr>
+            <w:r/>
+            <w:r>
+              <w:rPr>
+                <w:b w:val="0"/>
+                <w:sz w:val="19"/>
+              </w:rPr>
+              <w:t>Virtual Network (Spoke)</w:t>
+            </w:r>
+          </w:p>
+        </w:tc>
+        <w:tc>
+          <w:tcPr>
+            <w:tcW w:type="dxa" w:w="4608"/>
+          </w:tcPr>
+          <w:p>
+            <w:pPr>
+              <w:spacing w:after="40" w:before="40"/>
+            </w:pPr>
+            <w:r/>
+            <w:r>
+              <w:rPr>
+                <w:b w:val="0"/>
+                <w:sz w:val="19"/>
+              </w:rPr>
+              <w:t>vnet-&lt;workload&gt;-&lt;region&gt; (z. B. 10.2.0.0/24)</w:t>
+            </w:r>
+          </w:p>
+        </w:tc>
+        <w:tc>
+          <w:tcPr>
+            <w:tcW w:type="dxa" w:w="1008"/>
+          </w:tcPr>
+          <w:p>
+            <w:pPr>
+              <w:spacing w:after="40" w:before="40"/>
+            </w:pPr>
+            <w:r/>
+            <w:r>
+              <w:rPr>
+                <w:b w:val="0"/>
+                <w:sz w:val="19"/>
+              </w:rPr>
+              <w:t>1</w:t>
+            </w:r>
+          </w:p>
+        </w:tc>
+        <w:tc>
+          <w:tcPr>
+            <w:tcW w:type="dxa" w:w="2592"/>
+          </w:tcPr>
+          <w:p>
+            <w:pPr>
+              <w:spacing w:after="40" w:before="40"/>
+            </w:pPr>
+            <w:r/>
+            <w:r>
+              <w:rPr>
+                <w:b w:val="0"/>
+                <w:sz w:val="19"/>
+              </w:rPr>
+              <w:t>Kostenlos</w:t>
+            </w:r>
+          </w:p>
+        </w:tc>
+      </w:tr>
+      <w:tr>
+        <w:tc>
+          <w:tcPr>
+            <w:tcW w:type="dxa" w:w="3312"/>
+          </w:tcPr>
+          <w:p>
+            <w:pPr>
+              <w:spacing w:after="40" w:before="40"/>
+            </w:pPr>
+            <w:r/>
+            <w:r>
+              <w:rPr>
+                <w:b w:val="0"/>
+                <w:sz w:val="19"/>
+              </w:rPr>
+              <w:t>Route Table</w:t>
+            </w:r>
+          </w:p>
+        </w:tc>
+        <w:tc>
+          <w:tcPr>
+            <w:tcW w:type="dxa" w:w="4608"/>
+          </w:tcPr>
+          <w:p>
+            <w:pPr>
+              <w:spacing w:after="40" w:before="40"/>
+            </w:pPr>
+            <w:r/>
+            <w:r>
+              <w:rPr>
+                <w:b w:val="0"/>
+                <w:sz w:val="19"/>
+              </w:rPr>
+              <w:t>rt-&lt;workload&gt;-&lt;region&gt; (Default-Route → Firewall)</w:t>
+            </w:r>
+          </w:p>
+        </w:tc>
+        <w:tc>
+          <w:tcPr>
+            <w:tcW w:type="dxa" w:w="1008"/>
+          </w:tcPr>
+          <w:p>
+            <w:pPr>
+              <w:spacing w:after="40" w:before="40"/>
+            </w:pPr>
+            <w:r/>
+            <w:r>
+              <w:rPr>
+                <w:b w:val="0"/>
+                <w:sz w:val="19"/>
+              </w:rPr>
+              <w:t>1</w:t>
+            </w:r>
+          </w:p>
+        </w:tc>
+        <w:tc>
+          <w:tcPr>
+            <w:tcW w:type="dxa" w:w="2592"/>
+          </w:tcPr>
+          <w:p>
+            <w:pPr>
+              <w:spacing w:after="40" w:before="40"/>
+            </w:pPr>
+            <w:r/>
+            <w:r>
+              <w:rPr>
+                <w:b w:val="0"/>
+                <w:sz w:val="19"/>
+              </w:rPr>
+              <w:t>Kostenlos</w:t>
+            </w:r>
+          </w:p>
+        </w:tc>
+      </w:tr>
+      <w:tr>
+        <w:tc>
+          <w:tcPr>
+            <w:tcW w:type="dxa" w:w="3312"/>
+          </w:tcPr>
+          <w:p>
+            <w:pPr>
+              <w:spacing w:after="40" w:before="40"/>
+            </w:pPr>
+            <w:r/>
+            <w:r>
+              <w:rPr>
+                <w:b w:val="0"/>
+                <w:sz w:val="19"/>
+              </w:rPr>
+              <w:t>VNet Peering Spoke→Hub</w:t>
+            </w:r>
+          </w:p>
+        </w:tc>
+        <w:tc>
+          <w:tcPr>
+            <w:tcW w:type="dxa" w:w="4608"/>
+          </w:tcPr>
+          <w:p>
+            <w:pPr>
+              <w:spacing w:after="40" w:before="40"/>
+            </w:pPr>
+            <w:r/>
+            <w:r>
+              <w:rPr>
+                <w:b w:val="0"/>
+                <w:sz w:val="19"/>
+              </w:rPr>
+              <w:t>spoke-to-hub</w:t>
+            </w:r>
+          </w:p>
+        </w:tc>
+        <w:tc>
+          <w:tcPr>
+            <w:tcW w:type="dxa" w:w="1008"/>
+          </w:tcPr>
+          <w:p>
+            <w:pPr>
+              <w:spacing w:after="40" w:before="40"/>
+            </w:pPr>
+            <w:r/>
+            <w:r>
+              <w:rPr>
+                <w:b w:val="0"/>
+                <w:sz w:val="19"/>
+              </w:rPr>
+              <w:t>1</w:t>
+            </w:r>
+          </w:p>
+        </w:tc>
+        <w:tc>
+          <w:tcPr>
+            <w:tcW w:type="dxa" w:w="2592"/>
+          </w:tcPr>
+          <w:p>
+            <w:pPr>
+              <w:spacing w:after="40" w:before="40"/>
+            </w:pPr>
+            <w:r/>
+            <w:r>
+              <w:rPr>
+                <w:b w:val="0"/>
+                <w:sz w:val="19"/>
+              </w:rPr>
+              <w:t>Gering (Datenübertragung)</w:t>
+            </w:r>
+          </w:p>
+        </w:tc>
+      </w:tr>
+      <w:tr>
+        <w:tc>
+          <w:tcPr>
+            <w:tcW w:type="dxa" w:w="3312"/>
+          </w:tcPr>
+          <w:p>
+            <w:pPr>
+              <w:spacing w:after="40" w:before="40"/>
+            </w:pPr>
+            <w:r/>
+            <w:r>
+              <w:rPr>
+                <w:b w:val="0"/>
+                <w:sz w:val="19"/>
+              </w:rPr>
+              <w:t>VNet Peering Hub→Spoke</w:t>
+            </w:r>
+          </w:p>
+        </w:tc>
+        <w:tc>
+          <w:tcPr>
+            <w:tcW w:type="dxa" w:w="4608"/>
+          </w:tcPr>
+          <w:p>
+            <w:pPr>
+              <w:spacing w:after="40" w:before="40"/>
+            </w:pPr>
+            <w:r/>
+            <w:r>
+              <w:rPr>
+                <w:b w:val="0"/>
+                <w:sz w:val="19"/>
+              </w:rPr>
+              <w:t>hub-to-spoke</w:t>
+            </w:r>
+          </w:p>
+        </w:tc>
+        <w:tc>
+          <w:tcPr>
+            <w:tcW w:type="dxa" w:w="1008"/>
+          </w:tcPr>
+          <w:p>
+            <w:pPr>
+              <w:spacing w:after="40" w:before="40"/>
+            </w:pPr>
+            <w:r/>
+            <w:r>
+              <w:rPr>
+                <w:b w:val="0"/>
+                <w:sz w:val="19"/>
+              </w:rPr>
+              <w:t>1</w:t>
+            </w:r>
+          </w:p>
+        </w:tc>
+        <w:tc>
+          <w:tcPr>
+            <w:tcW w:type="dxa" w:w="2592"/>
+          </w:tcPr>
+          <w:p>
+            <w:pPr>
+              <w:spacing w:after="40" w:before="40"/>
+            </w:pPr>
+            <w:r/>
+            <w:r>
+              <w:rPr>
+                <w:b w:val="0"/>
+                <w:sz w:val="19"/>
+              </w:rPr>
+              <w:t>Gering (Datenübertragung)</w:t>
+            </w:r>
+          </w:p>
+        </w:tc>
+      </w:tr>
+      <w:tr>
+        <w:tc>
+          <w:tcPr>
+            <w:tcW w:type="dxa" w:w="3312"/>
+          </w:tcPr>
+          <w:p>
+            <w:pPr>
+              <w:spacing w:after="40" w:before="40"/>
+            </w:pPr>
+            <w:r/>
+            <w:r>
+              <w:rPr>
+                <w:b w:val="0"/>
+                <w:sz w:val="19"/>
+              </w:rPr>
+              <w:t>Private DNS Zone Link</w:t>
+            </w:r>
+          </w:p>
+        </w:tc>
+        <w:tc>
+          <w:tcPr>
+            <w:tcW w:type="dxa" w:w="4608"/>
+          </w:tcPr>
+          <w:p>
+            <w:pPr>
+              <w:spacing w:after="40" w:before="40"/>
+            </w:pPr>
+            <w:r/>
+            <w:r>
+              <w:rPr>
+                <w:b w:val="0"/>
+                <w:sz w:val="19"/>
+              </w:rPr>
+              <w:t>Link je Zone zu Spoke VNet</w:t>
+            </w:r>
+          </w:p>
+        </w:tc>
+        <w:tc>
+          <w:tcPr>
+            <w:tcW w:type="dxa" w:w="1008"/>
+          </w:tcPr>
+          <w:p>
+            <w:pPr>
+              <w:spacing w:after="40" w:before="40"/>
+            </w:pPr>
+            <w:r/>
+            <w:r>
+              <w:rPr>
+                <w:b w:val="0"/>
+                <w:sz w:val="19"/>
+              </w:rPr>
+              <w:t>37</w:t>
+            </w:r>
+          </w:p>
+        </w:tc>
+        <w:tc>
+          <w:tcPr>
+            <w:tcW w:type="dxa" w:w="2592"/>
+          </w:tcPr>
+          <w:p>
+            <w:pPr>
+              <w:spacing w:after="40" w:before="40"/>
+            </w:pPr>
+            <w:r/>
+            <w:r>
+              <w:rPr>
+                <w:b w:val="0"/>
+                <w:sz w:val="19"/>
+              </w:rPr>
+              <w:t>Kostenlos</w:t>
+            </w:r>
+          </w:p>
+        </w:tc>
+      </w:tr>
+    </w:tbl>
+    <w:p/>
+    <w:p>
+      <w:pPr>
+        <w:pStyle w:val="Heading2"/>
+      </w:pPr>
+      <w:r>
+        <w:t>5.6 Subscription Vending (MG-Scope)</w:t>
+      </w:r>
+    </w:p>
+    <w:tbl>
+      <w:tblPr>
+        <w:tblStyle w:val="LightGrid-Accent1"/>
+        <w:tblW w:type="auto" w:w="0"/>
+        <w:jc w:val="center"/>
+        <w:tblLook w:firstColumn="1" w:firstRow="1" w:lastColumn="0" w:lastRow="0" w:noHBand="0" w:noVBand="1" w:val="04A0"/>
+      </w:tblPr>
+      <w:tblGrid>
+        <w:gridCol w:w="2160"/>
+        <w:gridCol w:w="2160"/>
+        <w:gridCol w:w="2160"/>
+        <w:gridCol w:w="2160"/>
+      </w:tblGrid>
+      <w:tr>
+        <w:tc>
+          <w:tcPr>
+            <w:tcW w:type="dxa" w:w="2592"/>
+            <w:shd w:val="clear" w:color="auto" w:fill="0078D4"/>
+          </w:tcPr>
+          <w:p>
+            <w:pPr>
+              <w:spacing w:after="40" w:before="40"/>
+            </w:pPr>
+            <w:r/>
+            <w:r>
+              <w:rPr>
+                <w:b/>
+                <w:color w:val="FFFFFF"/>
+                <w:sz w:val="19"/>
+              </w:rPr>
+              <w:t>Modus</w:t>
+            </w:r>
+          </w:p>
+        </w:tc>
+        <w:tc>
+          <w:tcPr>
+            <w:tcW w:type="dxa" w:w="4752"/>
+            <w:shd w:val="clear" w:color="auto" w:fill="0078D4"/>
+          </w:tcPr>
+          <w:p>
+            <w:pPr>
+              <w:spacing w:after="40" w:before="40"/>
+            </w:pPr>
+            <w:r/>
+            <w:r>
+              <w:rPr>
+                <w:b/>
+                <w:color w:val="FFFFFF"/>
+                <w:sz w:val="19"/>
+              </w:rPr>
+              <w:t>Ressource / Aktion</w:t>
+            </w:r>
+          </w:p>
+        </w:tc>
+        <w:tc>
+          <w:tcPr>
+            <w:tcW w:type="dxa" w:w="3456"/>
+            <w:shd w:val="clear" w:color="auto" w:fill="0078D4"/>
+          </w:tcPr>
+          <w:p>
+            <w:pPr>
+              <w:spacing w:after="40" w:before="40"/>
+            </w:pPr>
+            <w:r/>
+            <w:r>
+              <w:rPr>
+                <w:b/>
+                <w:color w:val="FFFFFF"/>
+                <w:sz w:val="19"/>
+              </w:rPr>
+              <w:t>Voraussetzung</w:t>
+            </w:r>
+          </w:p>
+        </w:tc>
+        <w:tc>
+          <w:tcPr>
+            <w:tcW w:type="dxa" w:w="720"/>
+            <w:shd w:val="clear" w:color="auto" w:fill="0078D4"/>
+          </w:tcPr>
+          <w:p>
+            <w:pPr>
+              <w:spacing w:after="40" w:before="40"/>
+            </w:pPr>
+            <w:r/>
+            <w:r>
+              <w:rPr>
+                <w:b/>
+                <w:color w:val="FFFFFF"/>
+                <w:sz w:val="19"/>
+              </w:rPr>
+              <w:t>Kosten</w:t>
+            </w:r>
+          </w:p>
+        </w:tc>
+      </w:tr>
+      <w:tr>
+        <w:tc>
+          <w:tcPr>
+            <w:tcW w:type="dxa" w:w="2592"/>
+          </w:tcPr>
+          <w:p>
+            <w:pPr>
+              <w:spacing w:after="40" w:before="40"/>
+            </w:pPr>
+            <w:r/>
+            <w:r>
+              <w:rPr>
+                <w:b w:val="0"/>
+                <w:sz w:val="19"/>
+              </w:rPr>
+              <w:t>Placement (Standard)</w:t>
+            </w:r>
+          </w:p>
+        </w:tc>
+        <w:tc>
+          <w:tcPr>
+            <w:tcW w:type="dxa" w:w="4752"/>
+          </w:tcPr>
+          <w:p>
+            <w:pPr>
+              <w:spacing w:after="40" w:before="40"/>
+            </w:pPr>
+            <w:r/>
+            <w:r>
+              <w:rPr>
+                <w:b w:val="0"/>
+                <w:sz w:val="19"/>
+              </w:rPr>
+              <w:t>Bestehende Subscription → Ziel-MG verschoben</w:t>
+            </w:r>
+          </w:p>
+        </w:tc>
+        <w:tc>
+          <w:tcPr>
+            <w:tcW w:type="dxa" w:w="3456"/>
+          </w:tcPr>
+          <w:p>
+            <w:pPr>
+              <w:spacing w:after="40" w:before="40"/>
+            </w:pPr>
+            <w:r/>
+            <w:r>
+              <w:rPr>
+                <w:b w:val="0"/>
+                <w:sz w:val="19"/>
+              </w:rPr>
+              <w:t>Keine Billing-Rechte nötig</w:t>
+            </w:r>
+          </w:p>
+        </w:tc>
+        <w:tc>
+          <w:tcPr>
+            <w:tcW w:type="dxa" w:w="720"/>
+          </w:tcPr>
+          <w:p>
+            <w:pPr>
+              <w:spacing w:after="40" w:before="40"/>
+            </w:pPr>
+            <w:r/>
+            <w:r>
+              <w:rPr>
+                <w:b w:val="0"/>
+                <w:sz w:val="19"/>
+              </w:rPr>
+              <w:t>Kostenlos</w:t>
+            </w:r>
+          </w:p>
+        </w:tc>
+      </w:tr>
+      <w:tr>
+        <w:tc>
+          <w:tcPr>
+            <w:tcW w:type="dxa" w:w="2592"/>
+          </w:tcPr>
+          <w:p>
+            <w:pPr>
+              <w:spacing w:after="40" w:before="40"/>
+            </w:pPr>
+            <w:r/>
+            <w:r>
+              <w:rPr>
+                <w:b w:val="0"/>
+                <w:sz w:val="19"/>
+              </w:rPr>
+              <w:t>Create (optional)</w:t>
+            </w:r>
+          </w:p>
+        </w:tc>
+        <w:tc>
+          <w:tcPr>
+            <w:tcW w:type="dxa" w:w="4752"/>
+          </w:tcPr>
+          <w:p>
+            <w:pPr>
+              <w:spacing w:after="40" w:before="40"/>
+            </w:pPr>
+            <w:r/>
+            <w:r>
+              <w:rPr>
+                <w:b w:val="0"/>
+                <w:sz w:val="19"/>
+              </w:rPr>
+              <w:t>Neue Subscription per EA/MCA Billing API erstellt</w:t>
+            </w:r>
+          </w:p>
+        </w:tc>
+        <w:tc>
+          <w:tcPr>
+            <w:tcW w:type="dxa" w:w="3456"/>
+          </w:tcPr>
+          <w:p>
+            <w:pPr>
+              <w:spacing w:after="40" w:before="40"/>
+            </w:pPr>
+            <w:r/>
+            <w:r>
+              <w:rPr>
+                <w:b w:val="0"/>
+                <w:sz w:val="19"/>
+              </w:rPr>
+              <w:t>Billing Account Owner-Rolle</w:t>
+            </w:r>
+          </w:p>
+        </w:tc>
+        <w:tc>
+          <w:tcPr>
+            <w:tcW w:type="dxa" w:w="720"/>
+          </w:tcPr>
+          <w:p>
+            <w:pPr>
+              <w:spacing w:after="40" w:before="40"/>
+            </w:pPr>
+            <w:r/>
+            <w:r>
+              <w:rPr>
+                <w:b w:val="0"/>
+                <w:sz w:val="19"/>
+              </w:rPr>
+              <w:t>Sub-abhängig</w:t>
+            </w:r>
+          </w:p>
+        </w:tc>
+      </w:tr>
+    </w:tbl>
+    <w:p/>
+    <w:p>
+      <w:pPr>
+        <w:pStyle w:val="Heading1"/>
+      </w:pPr>
+      <w:r>
+        <w:t>6. Infrastructure as Code &amp; CI/CD</w:t>
       </w:r>
     </w:p>
     <w:p>
@@ -1102,7 +5160,7 @@
         <w:pStyle w:val="Heading1"/>
       </w:pPr>
       <w:r>
-        <w:t>6. Namens- &amp; Adresskonzept</w:t>
+        <w:t>7. Namens- &amp; Adresskonzept</w:t>
       </w:r>
     </w:p>
     <w:tbl>
@@ -1393,7 +5451,7 @@
         <w:pStyle w:val="Heading1"/>
       </w:pPr>
       <w:r>
-        <w:t>7. Betrieb &amp; Verifikation</w:t>
+        <w:t>8. Betrieb &amp; Verifikation</w:t>
       </w:r>
     </w:p>
     <w:p>
@@ -1829,7 +5887,7 @@
         <w:pStyle w:val="Heading1"/>
       </w:pPr>
       <w:r>
-        <w:t>8. Umsetzungsstatus</w:t>
+        <w:t>9. Umsetzungsstatus</w:t>
       </w:r>
     </w:p>
     <w:tbl>
@@ -2348,7 +6406,7 @@
         <w:pStyle w:val="Heading1"/>
       </w:pPr>
       <w:r>
-        <w:t>9. Roadmap / nächste Schritte</w:t>
+        <w:t>10. Roadmap / nächste Schritte</w:t>
       </w:r>
     </w:p>
     <w:p>
@@ -2404,7 +6462,7 @@
         <w:pStyle w:val="Heading1"/>
       </w:pPr>
       <w:r>
-        <w:t>10. Entscheidungs- &amp; Beratungspunkte (Kickoff)</w:t>
+        <w:t>11. Entscheidungs- &amp; Beratungspunkte (Kickoff)</w:t>
       </w:r>
     </w:p>
     <w:p>
@@ -3168,7 +7226,7 @@
         <w:pStyle w:val="Heading1"/>
       </w:pPr>
       <w:r>
-        <w:t>11. Voraussetzungen</w:t>
+        <w:t>12. Voraussetzungen</w:t>
       </w:r>
     </w:p>
     <w:p>
@@ -3216,7 +7274,7 @@
         <w:pStyle w:val="Heading1"/>
       </w:pPr>
       <w:r>
-        <w:t>12. Glossar</w:t>
+        <w:t>13. Glossar</w:t>
       </w:r>
     </w:p>
     <w:tbl>

</xml_diff>